<commit_message>
ci: daily run 2026-10-02
</commit_message>
<xml_diff>
--- a/tailored/cv_appalachian-growth-solutions_full-stack-developer-mern-stack-ai-vibe-.docx
+++ b/tailored/cv_appalachian-growth-solutions_full-stack-developer-mern-stack-ai-vibe-.docx
@@ -17,7 +17,7 @@
     </w:p>
     <w:p>
       <w:r>
-        <w:t>**Email:** muzzamilhassandev@gmail.com | **Phone:** +923055779207 | **LinkedIn:** linkedin.com/in/muzzamilhassann | **GitHub:** github.com/muzzamilhassan | **Portfolio:** muzzamilhassandev.vercel.app</w:t>
+        <w:t>muzzamilhassandev@gmail.com | +923055779207 | https://muzzamilhassandev.vercel.app/</w:t>
       </w:r>
     </w:p>
     <w:p>
@@ -30,7 +30,7 @@
     </w:p>
     <w:p>
       <w:r>
-        <w:t>Full Stack Developer with expertise in building and shipping production-grade SaaS products using the MERN stack (MongoDB, Express.js, React.js, Node.js). Proficient in AI-assisted development with LangChain, LangGraph, and OpenAI API. Experienced in architecting full-stack applications, developing REST APIs, working with databases, and implementing modern development workflows. Passionate about turning ideas into working products while maintaining clean, reusable code.</w:t>
+        <w:t>Full Stack Developer with expertise in building production-grade web applications using the MERN stack (MongoDB, Express.js, React.js, Node.js). Experienced in architecting and shipping end-to-end SaaS products with a focus on AI integration. Proficient in modern development practices, AI-assisted coding, and creating responsive, user-friendly interfaces. Demonstrated ability to work on both frontend and backend, develop REST APIs, and work with various databases while maintaining clean, reusable code.</w:t>
       </w:r>
     </w:p>
     <w:p>
@@ -38,7 +38,12 @@
         <w:pStyle w:val="Heading2"/>
       </w:pPr>
       <w:r>
-        <w:t>TECHNICAL SKILLS</w:t>
+        <w:t>SKILLS</w:t>
+      </w:r>
+    </w:p>
+    <w:p>
+      <w:r>
+        <w:t>**MERN Stack**</w:t>
       </w:r>
     </w:p>
     <w:p>
@@ -46,7 +51,7 @@
         <w:pStyle w:val="ListBullet"/>
       </w:pPr>
       <w:r>
-        <w:t>**Frontend:** React.js, Next.js, Redux Toolkit, TanStack Query, Tailwind CSS</w:t>
+        <w:t>MongoDB, Express.js, React.js, Node.js</w:t>
       </w:r>
     </w:p>
     <w:p>
@@ -54,7 +59,7 @@
         <w:pStyle w:val="ListBullet"/>
       </w:pPr>
       <w:r>
-        <w:t>**Backend:** Node.js, Express.js, NestJS, REST API Design, JWT/OAuth2 Authentication</w:t>
+        <w:t>Next.js, TypeScript, TanStack Query</w:t>
       </w:r>
     </w:p>
     <w:p>
@@ -62,7 +67,12 @@
         <w:pStyle w:val="ListBullet"/>
       </w:pPr>
       <w:r>
-        <w:t>**Databases:** MongoDB, PostgreSQL, MySQL, SQLite, Drizzle ORM, Firebase, Supabase</w:t>
+        <w:t>REST API Design, JWT/OAuth2 Authentication</w:t>
+      </w:r>
+    </w:p>
+    <w:p>
+      <w:r>
+        <w:t>**AI Development**</w:t>
       </w:r>
     </w:p>
     <w:p>
@@ -70,7 +80,7 @@
         <w:pStyle w:val="ListBullet"/>
       </w:pPr>
       <w:r>
-        <w:t>**AI Tools:** LangChain, LangGraph, OpenAI API</w:t>
+        <w:t>LangChain, LangGraph, OpenAI API</w:t>
       </w:r>
     </w:p>
     <w:p>
@@ -78,7 +88,7 @@
         <w:pStyle w:val="ListBullet"/>
       </w:pPr>
       <w:r>
-        <w:t>**Development:** Git, GitHub, Docker, Vercel, AWS Amplify, JIRA</w:t>
+        <w:t>AI-powered content generation and workflow automation</w:t>
       </w:r>
     </w:p>
     <w:p>
@@ -86,7 +96,115 @@
         <w:pStyle w:val="ListBullet"/>
       </w:pPr>
       <w:r>
-        <w:t>**Other:** Component architecture, Lazy Loading, Code Splitting, SEO, a11y, Performance Optimization</w:t>
+        <w:t>AI-assisted development and debugging</w:t>
+      </w:r>
+    </w:p>
+    <w:p>
+      <w:r>
+        <w:t>**Frontend**</w:t>
+      </w:r>
+    </w:p>
+    <w:p>
+      <w:pPr>
+        <w:pStyle w:val="ListBullet"/>
+      </w:pPr>
+      <w:r>
+        <w:t>HTML5, CSS3, JavaScript (ES6+)</w:t>
+      </w:r>
+    </w:p>
+    <w:p>
+      <w:pPr>
+        <w:pStyle w:val="ListBullet"/>
+      </w:pPr>
+      <w:r>
+        <w:t>React.js, Next.js, Redux Toolkit</w:t>
+      </w:r>
+    </w:p>
+    <w:p>
+      <w:pPr>
+        <w:pStyle w:val="ListBullet"/>
+      </w:pPr>
+      <w:r>
+        <w:t>Tailwind CSS, Responsive Design</w:t>
+      </w:r>
+    </w:p>
+    <w:p>
+      <w:r>
+        <w:t>**Backend**</w:t>
+      </w:r>
+    </w:p>
+    <w:p>
+      <w:pPr>
+        <w:pStyle w:val="ListBullet"/>
+      </w:pPr>
+      <w:r>
+        <w:t>Node.js, Express.js, NestJS</w:t>
+      </w:r>
+    </w:p>
+    <w:p>
+      <w:pPr>
+        <w:pStyle w:val="ListBullet"/>
+      </w:pPr>
+      <w:r>
+        <w:t>Authentication &amp; Authorization (RBAC)</w:t>
+      </w:r>
+    </w:p>
+    <w:p>
+      <w:pPr>
+        <w:pStyle w:val="ListBullet"/>
+      </w:pPr>
+      <w:r>
+        <w:t>API Integration (Stripe, Google Maps)</w:t>
+      </w:r>
+    </w:p>
+    <w:p>
+      <w:r>
+        <w:t>**Databases**</w:t>
+      </w:r>
+    </w:p>
+    <w:p>
+      <w:pPr>
+        <w:pStyle w:val="ListBullet"/>
+      </w:pPr>
+      <w:r>
+        <w:t>MongoDB, PostgreSQL, MySQL, SQLite</w:t>
+      </w:r>
+    </w:p>
+    <w:p>
+      <w:pPr>
+        <w:pStyle w:val="ListBullet"/>
+      </w:pPr>
+      <w:r>
+        <w:t>Drizzle ORM, Firebase, Supabase</w:t>
+      </w:r>
+    </w:p>
+    <w:p>
+      <w:r>
+        <w:t>**Development Tools**</w:t>
+      </w:r>
+    </w:p>
+    <w:p>
+      <w:pPr>
+        <w:pStyle w:val="ListBullet"/>
+      </w:pPr>
+      <w:r>
+        <w:t>Git, GitHub, Docker</w:t>
+      </w:r>
+    </w:p>
+    <w:p>
+      <w:pPr>
+        <w:pStyle w:val="ListBullet"/>
+      </w:pPr>
+      <w:r>
+        <w:t>Vercel (CI/CD), AWS Amplify</w:t>
+      </w:r>
+    </w:p>
+    <w:p>
+      <w:pPr>
+        <w:pStyle w:val="ListBullet"/>
+      </w:pPr>
+      <w:r>
+        <w:t>Figma, JIRA</w:t>
       </w:r>
     </w:p>
     <w:p>
@@ -94,12 +212,17 @@
         <w:pStyle w:val="Heading2"/>
       </w:pPr>
       <w:r>
-        <w:t>PROFESSIONAL EXPERIENCE</w:t>
+        <w:t>EXPERIENCE</w:t>
       </w:r>
     </w:p>
     <w:p>
       <w:r>
-        <w:t>**Full Stack Developer** | Revnix (fmr. Revnix Technologies) | Jan 2025 - Present</w:t>
+        <w:t>**Full Stack Developer** | Revnix (fmr. Revnix Technologies)</w:t>
+      </w:r>
+    </w:p>
+    <w:p>
+      <w:r>
+        <w:t>Jan 2025 - Present | On-site</w:t>
       </w:r>
     </w:p>
     <w:p>
@@ -115,7 +238,7 @@
         <w:pStyle w:val="ListBullet"/>
       </w:pPr>
       <w:r>
-        <w:t>Owned the full authentication and access control layer with JWT-based auth and flexible RBAC system</w:t>
+        <w:t>Owned full authentication and access control layer with JWT-based auth and flexible RBAC system</w:t>
       </w:r>
     </w:p>
     <w:p>
@@ -131,7 +254,7 @@
         <w:pStyle w:val="ListBullet"/>
       </w:pPr>
       <w:r>
-        <w:t>Optimized performance through SSR, caching, lazy loading, and code splitting</w:t>
+        <w:t>Built responsive UIs with Tailwind CSS, adhering to strict a11y and SEO standards</w:t>
       </w:r>
     </w:p>
     <w:p>
@@ -139,7 +262,7 @@
         <w:pStyle w:val="ListBullet"/>
       </w:pPr>
       <w:r>
-        <w:t>Built responsive UIs with Tailwind CSS, adhering to strict a11y and SEO standards</w:t>
+        <w:t>Optimized performance through SSR, caching, lazy loading, and code splitting</w:t>
       </w:r>
     </w:p>
     <w:p>
@@ -160,7 +283,7 @@
         <w:pStyle w:val="ListBullet"/>
       </w:pPr>
       <w:r>
-        <w:t>Developed SaaS platform for AI-driven content generation and workflow automation using Next.js, React.js, and Node.js</w:t>
+        <w:t>Built a SaaS platform for AI-driven content generation and workflow automation using Next.js, React.js, and Node.js</w:t>
       </w:r>
     </w:p>
     <w:p>
@@ -168,7 +291,7 @@
         <w:pStyle w:val="ListBullet"/>
       </w:pPr>
       <w:r>
-        <w:t>Implemented AI article generation with keyword input and E-E-A-T optimization controls</w:t>
+        <w:t>Integrated LangChain, LangGraph, and OpenAI API for AI article generation with keyword optimization</w:t>
       </w:r>
     </w:p>
     <w:p>
@@ -176,7 +299,7 @@
         <w:pStyle w:val="ListBullet"/>
       </w:pPr>
       <w:r>
-        <w:t>Integrated CMS auto-publish functionality with WordPress, Webflow, and Ghost APIs using OAuth flows</w:t>
+        <w:t>Implemented one-click CMS auto-publish with WordPress, Webflow, and Ghost APIs using OAuth flows</w:t>
       </w:r>
     </w:p>
     <w:p>
@@ -184,7 +307,7 @@
         <w:pStyle w:val="ListBullet"/>
       </w:pPr>
       <w:r>
-        <w:t>Applied performance optimization techniques including SSR, caching, and code splitting</w:t>
+        <w:t>Optimized frontend performance with SSR, caching, lazy loading, and code splitting</w:t>
       </w:r>
     </w:p>
     <w:p>
@@ -197,7 +320,7 @@
         <w:pStyle w:val="ListBullet"/>
       </w:pPr>
       <w:r>
-        <w:t>Built AI-assisted recruitment platform end-to-end using Next.js, React, Node.js, and AI tools</w:t>
+        <w:t>Developed AI-assisted recruitment platform with React.js, Node.js, and AI integration</w:t>
       </w:r>
     </w:p>
     <w:p>
@@ -205,12 +328,12 @@
         <w:pStyle w:val="ListBullet"/>
       </w:pPr>
       <w:r>
-        <w:t>Implemented LangChain and LangGraph for AI-powered candidate evaluation</w:t>
+        <w:t>Implemented LangChain and OpenAI API for candidate evaluation and assessment features</w:t>
       </w:r>
     </w:p>
     <w:p>
       <w:r>
-        <w:t>**21Century Equipment** | B2B Equipment Management Platform</w:t>
+        <w:t>**Nextly** | Enterprise Headless CMS &amp; SaaS Framework</w:t>
       </w:r>
     </w:p>
     <w:p>
@@ -218,7 +341,7 @@
         <w:pStyle w:val="ListBullet"/>
       </w:pPr>
       <w:r>
-        <w:t>Developed full-stack application using Next.js, React, Redux Toolkit, and third-party APIs</w:t>
+        <w:t>Created a TypeScript-first CMS framework for content-driven products using Next.js and Drizzle ORM</w:t>
       </w:r>
     </w:p>
     <w:p>
@@ -226,12 +349,7 @@
         <w:pStyle w:val="ListBullet"/>
       </w:pPr>
       <w:r>
-        <w:t>Integrated Stripe for payment processing and Google Maps API for location features</w:t>
-      </w:r>
-    </w:p>
-    <w:p>
-      <w:r>
-        <w:t>**4Rivers Equipment** | Enterprise E-Commerce &amp; Rental Platform</w:t>
+        <w:t>Built dual-mode content workflow with code-defined models and drag-and-drop visual builder</w:t>
       </w:r>
     </w:p>
     <w:p>
@@ -239,7 +357,28 @@
         <w:pStyle w:val="ListBullet"/>
       </w:pPr>
       <w:r>
-        <w:t>Created responsive e-commerce solution with Next.js, React, Redux Toolkit, and Stripe integration</w:t>
+        <w:t>Implemented pluggable database adapters supporting MongoDB, PostgreSQL, MySQL, and SQLite</w:t>
+      </w:r>
+    </w:p>
+    <w:p>
+      <w:r>
+        <w:t>**21Century Equipment &amp; 4Rivers Equipment** | E-Commerce Platforms</w:t>
+      </w:r>
+    </w:p>
+    <w:p>
+      <w:pPr>
+        <w:pStyle w:val="ListBullet"/>
+      </w:pPr>
+      <w:r>
+        <w:t>Developed B2B equipment management and enterprise e-commerce platforms using React.js, Redux Toolkit, and Stripe API</w:t>
+      </w:r>
+    </w:p>
+    <w:p>
+      <w:pPr>
+        <w:pStyle w:val="ListBullet"/>
+      </w:pPr>
+      <w:r>
+        <w:t>Integrated Google Maps API for location-based features</w:t>
       </w:r>
     </w:p>
     <w:p>
@@ -252,15 +391,12 @@
     </w:p>
     <w:p>
       <w:r>
-        <w:t>**BS in Computer Science** | University of Haripur | Aug 2020 - Aug 2024</w:t>
+        <w:t>**BS in Computer Science** | University of Haripur</w:t>
       </w:r>
     </w:p>
     <w:p>
-      <w:pPr>
-        <w:pStyle w:val="ListBullet"/>
-      </w:pPr>
       <w:r>
-        <w:t>Haripur, Pakistan</w:t>
+        <w:t>Aug 2020 - Aug 2024 | Haripur, Pakistan</w:t>
       </w:r>
     </w:p>
     <w:p>
@@ -272,9 +408,6 @@
       </w:r>
     </w:p>
     <w:p>
-      <w:pPr>
-        <w:pStyle w:val="ListBullet"/>
-      </w:pPr>
       <w:r>
         <w:t>English, Urdu</w:t>
       </w:r>

</xml_diff>

<commit_message>
ci: daily run 2026-10-04
</commit_message>
<xml_diff>
--- a/tailored/cv_appalachian-growth-solutions_full-stack-developer-mern-stack-ai-vibe-.docx
+++ b/tailored/cv_appalachian-growth-solutions_full-stack-developer-mern-stack-ai-vibe-.docx
@@ -30,7 +30,7 @@
     </w:p>
     <w:p>
       <w:r>
-        <w:t>Full Stack Developer with expertise in building production-grade web applications using the MERN stack (MongoDB, Express.js, React.js, Node.js). Experienced in architecting and shipping end-to-end SaaS products with a focus on AI integration. Proficient in modern development practices, AI-assisted coding, and creating responsive, user-friendly interfaces. Demonstrated ability to work on both frontend and backend, develop REST APIs, and work with various databases while maintaining clean, reusable code.</w:t>
+        <w:t>Full Stack Developer with expertise in building production-grade SaaS products using the MERN stack (MongoDB, Express.js, React.js, Node.js). Experienced in architecting and shipping end-to-end solutions with a focus on AI integration, responsive UIs, and scalable backend systems. Proficient in modern development practices, AI-assisted coding, and creating maintainable codebases.</w:t>
       </w:r>
     </w:p>
     <w:p>
@@ -38,12 +38,7 @@
         <w:pStyle w:val="Heading2"/>
       </w:pPr>
       <w:r>
-        <w:t>SKILLS</w:t>
-      </w:r>
-    </w:p>
-    <w:p>
-      <w:r>
-        <w:t>**MERN Stack**</w:t>
+        <w:t>TECHNICAL SKILLS</w:t>
       </w:r>
     </w:p>
     <w:p>
@@ -51,7 +46,7 @@
         <w:pStyle w:val="ListBullet"/>
       </w:pPr>
       <w:r>
-        <w:t>MongoDB, Express.js, React.js, Node.js</w:t>
+        <w:t>**Frontend**: React.js, Next.js, Redux Toolkit, TanStack Query, Tailwind CSS</w:t>
       </w:r>
     </w:p>
     <w:p>
@@ -59,7 +54,7 @@
         <w:pStyle w:val="ListBullet"/>
       </w:pPr>
       <w:r>
-        <w:t>Next.js, TypeScript, TanStack Query</w:t>
+        <w:t>**Backend**: Node.js, Express.js, NestJS, REST API Design, JWT/OAuth2 Authentication</w:t>
       </w:r>
     </w:p>
     <w:p>
@@ -67,12 +62,7 @@
         <w:pStyle w:val="ListBullet"/>
       </w:pPr>
       <w:r>
-        <w:t>REST API Design, JWT/OAuth2 Authentication</w:t>
-      </w:r>
-    </w:p>
-    <w:p>
-      <w:r>
-        <w:t>**AI Development**</w:t>
+        <w:t>**Databases**: MongoDB, PostgreSQL, MySQL, SQLite, Drizzle ORM, Firebase, Supabase</w:t>
       </w:r>
     </w:p>
     <w:p>
@@ -80,7 +70,7 @@
         <w:pStyle w:val="ListBullet"/>
       </w:pPr>
       <w:r>
-        <w:t>LangChain, LangGraph, OpenAI API</w:t>
+        <w:t>**AI Integration**: LangChain, LangGraph, OpenAI API</w:t>
       </w:r>
     </w:p>
     <w:p>
@@ -88,7 +78,7 @@
         <w:pStyle w:val="ListBullet"/>
       </w:pPr>
       <w:r>
-        <w:t>AI-powered content generation and workflow automation</w:t>
+        <w:t>**Development Tools**: Git, GitHub, Docker, Vercel, AWS Amplify</w:t>
       </w:r>
     </w:p>
     <w:p>
@@ -96,12 +86,20 @@
         <w:pStyle w:val="ListBullet"/>
       </w:pPr>
       <w:r>
-        <w:t>AI-assisted development and debugging</w:t>
+        <w:t>**Practices**: Component architecture, SEO, a11y, Performance Optimization</w:t>
+      </w:r>
+    </w:p>
+    <w:p>
+      <w:pPr>
+        <w:pStyle w:val="Heading2"/>
+      </w:pPr>
+      <w:r>
+        <w:t>PROFESSIONAL EXPERIENCE</w:t>
       </w:r>
     </w:p>
     <w:p>
       <w:r>
-        <w:t>**Frontend**</w:t>
+        <w:t>**Full Stack Developer** | Revnix (fmr. Revnix Technologies) | Jan 2025 - Present</w:t>
       </w:r>
     </w:p>
     <w:p>
@@ -109,128 +107,7 @@
         <w:pStyle w:val="ListBullet"/>
       </w:pPr>
       <w:r>
-        <w:t>HTML5, CSS3, JavaScript (ES6+)</w:t>
-      </w:r>
-    </w:p>
-    <w:p>
-      <w:pPr>
-        <w:pStyle w:val="ListBullet"/>
-      </w:pPr>
-      <w:r>
-        <w:t>React.js, Next.js, Redux Toolkit</w:t>
-      </w:r>
-    </w:p>
-    <w:p>
-      <w:pPr>
-        <w:pStyle w:val="ListBullet"/>
-      </w:pPr>
-      <w:r>
-        <w:t>Tailwind CSS, Responsive Design</w:t>
-      </w:r>
-    </w:p>
-    <w:p>
-      <w:r>
-        <w:t>**Backend**</w:t>
-      </w:r>
-    </w:p>
-    <w:p>
-      <w:pPr>
-        <w:pStyle w:val="ListBullet"/>
-      </w:pPr>
-      <w:r>
-        <w:t>Node.js, Express.js, NestJS</w:t>
-      </w:r>
-    </w:p>
-    <w:p>
-      <w:pPr>
-        <w:pStyle w:val="ListBullet"/>
-      </w:pPr>
-      <w:r>
-        <w:t>Authentication &amp; Authorization (RBAC)</w:t>
-      </w:r>
-    </w:p>
-    <w:p>
-      <w:pPr>
-        <w:pStyle w:val="ListBullet"/>
-      </w:pPr>
-      <w:r>
-        <w:t>API Integration (Stripe, Google Maps)</w:t>
-      </w:r>
-    </w:p>
-    <w:p>
-      <w:r>
-        <w:t>**Databases**</w:t>
-      </w:r>
-    </w:p>
-    <w:p>
-      <w:pPr>
-        <w:pStyle w:val="ListBullet"/>
-      </w:pPr>
-      <w:r>
-        <w:t>MongoDB, PostgreSQL, MySQL, SQLite</w:t>
-      </w:r>
-    </w:p>
-    <w:p>
-      <w:pPr>
-        <w:pStyle w:val="ListBullet"/>
-      </w:pPr>
-      <w:r>
-        <w:t>Drizzle ORM, Firebase, Supabase</w:t>
-      </w:r>
-    </w:p>
-    <w:p>
-      <w:r>
-        <w:t>**Development Tools**</w:t>
-      </w:r>
-    </w:p>
-    <w:p>
-      <w:pPr>
-        <w:pStyle w:val="ListBullet"/>
-      </w:pPr>
-      <w:r>
-        <w:t>Git, GitHub, Docker</w:t>
-      </w:r>
-    </w:p>
-    <w:p>
-      <w:pPr>
-        <w:pStyle w:val="ListBullet"/>
-      </w:pPr>
-      <w:r>
-        <w:t>Vercel (CI/CD), AWS Amplify</w:t>
-      </w:r>
-    </w:p>
-    <w:p>
-      <w:pPr>
-        <w:pStyle w:val="ListBullet"/>
-      </w:pPr>
-      <w:r>
-        <w:t>Figma, JIRA</w:t>
-      </w:r>
-    </w:p>
-    <w:p>
-      <w:pPr>
-        <w:pStyle w:val="Heading2"/>
-      </w:pPr>
-      <w:r>
-        <w:t>EXPERIENCE</w:t>
-      </w:r>
-    </w:p>
-    <w:p>
-      <w:r>
-        <w:t>**Full Stack Developer** | Revnix (fmr. Revnix Technologies)</w:t>
-      </w:r>
-    </w:p>
-    <w:p>
-      <w:r>
-        <w:t>Jan 2025 - Present | On-site</w:t>
-      </w:r>
-    </w:p>
-    <w:p>
-      <w:pPr>
-        <w:pStyle w:val="ListBullet"/>
-      </w:pPr>
-      <w:r>
-        <w:t>Architected and shipped production features for an enterprise headless CMS using Next.js, TypeScript, and TanStack Query</w:t>
+        <w:t>Architected and shipped production features for enterprise headless CMS using Next.js App Router, TypeScript, and TanStack Query</w:t>
       </w:r>
     </w:p>
     <w:p>
@@ -246,7 +123,7 @@
         <w:pStyle w:val="ListBullet"/>
       </w:pPr>
       <w:r>
-        <w:t>Designed and maintained a pluggable multi-database adapter system supporting MongoDB, PostgreSQL, MySQL, and SQLite</w:t>
+        <w:t>Designed and maintained pluggable multi-database adapter system supporting PostgreSQL, MySQL, SQLite</w:t>
       </w:r>
     </w:p>
     <w:p>
@@ -254,7 +131,7 @@
         <w:pStyle w:val="ListBullet"/>
       </w:pPr>
       <w:r>
-        <w:t>Built responsive UIs with Tailwind CSS, adhering to strict a11y and SEO standards</w:t>
+        <w:t>Optimized performance through SSR, caching, lazy loading, code splitting, and API improvements</w:t>
       </w:r>
     </w:p>
     <w:p>
@@ -262,7 +139,15 @@
         <w:pStyle w:val="ListBullet"/>
       </w:pPr>
       <w:r>
-        <w:t>Optimized performance through SSR, caching, lazy loading, and code splitting</w:t>
+        <w:t>Built customizable admin dashboard for collections, media uploads, user roles, and system settings</w:t>
+      </w:r>
+    </w:p>
+    <w:p>
+      <w:pPr>
+        <w:pStyle w:val="ListBullet"/>
+      </w:pPr>
+      <w:r>
+        <w:t>Delivered pixel-perfect, responsive UIs with Tailwind CSS, strict a11y and SEO standards</w:t>
       </w:r>
     </w:p>
     <w:p>
@@ -270,12 +155,12 @@
         <w:pStyle w:val="Heading2"/>
       </w:pPr>
       <w:r>
-        <w:t>PROJECTS</w:t>
+        <w:t>KEY PROJECTS</w:t>
       </w:r>
     </w:p>
     <w:p>
       <w:r>
-        <w:t>**RextAI** | AI-Powered Content Intelligence Platform</w:t>
+        <w:t>**RextAI** - AI-Powered Content Intelligence Platform</w:t>
       </w:r>
     </w:p>
     <w:p>
@@ -283,7 +168,7 @@
         <w:pStyle w:val="ListBullet"/>
       </w:pPr>
       <w:r>
-        <w:t>Built a SaaS platform for AI-driven content generation and workflow automation using Next.js, React.js, and Node.js</w:t>
+        <w:t>Built SaaS platform for AI-driven content generation, editing, and workflow automation</w:t>
       </w:r>
     </w:p>
     <w:p>
@@ -291,7 +176,7 @@
         <w:pStyle w:val="ListBullet"/>
       </w:pPr>
       <w:r>
-        <w:t>Integrated LangChain, LangGraph, and OpenAI API for AI article generation with keyword optimization</w:t>
+        <w:t>Implemented AI article generation with keyword input, E-E-A-T optimization, and humanization layer</w:t>
       </w:r>
     </w:p>
     <w:p>
@@ -299,7 +184,7 @@
         <w:pStyle w:val="ListBullet"/>
       </w:pPr>
       <w:r>
-        <w:t>Implemented one-click CMS auto-publish with WordPress, Webflow, and Ghost APIs using OAuth flows</w:t>
+        <w:t>Integrated CMS auto-publishing with WordPress, Webflow, and Ghost APIs using OAuth flows</w:t>
       </w:r>
     </w:p>
     <w:p>
@@ -312,7 +197,7 @@
     </w:p>
     <w:p>
       <w:r>
-        <w:t>**HireIQ** | AI-Powered Recruitment &amp; Evaluation Platform</w:t>
+        <w:t>**HireIQ** - AI-Powered Recruitment &amp; Evaluation Platform</w:t>
       </w:r>
     </w:p>
     <w:p>
@@ -320,7 +205,7 @@
         <w:pStyle w:val="ListBullet"/>
       </w:pPr>
       <w:r>
-        <w:t>Developed AI-assisted recruitment platform with React.js, Node.js, and AI integration</w:t>
+        <w:t>Developed AI-assisted recruitment and candidate evaluation platform end-to-end</w:t>
       </w:r>
     </w:p>
     <w:p>
@@ -328,12 +213,12 @@
         <w:pStyle w:val="ListBullet"/>
       </w:pPr>
       <w:r>
-        <w:t>Implemented LangChain and OpenAI API for candidate evaluation and assessment features</w:t>
+        <w:t>Implemented LangChain and LangGraph for AI-powered candidate analysis and matching</w:t>
       </w:r>
     </w:p>
     <w:p>
       <w:r>
-        <w:t>**Nextly** | Enterprise Headless CMS &amp; SaaS Framework</w:t>
+        <w:t>**Nextly** - Enterprise Headless CMS &amp; SaaS Framework</w:t>
       </w:r>
     </w:p>
     <w:p>
@@ -341,7 +226,7 @@
         <w:pStyle w:val="ListBullet"/>
       </w:pPr>
       <w:r>
-        <w:t>Created a TypeScript-first CMS framework for content-driven products using Next.js and Drizzle ORM</w:t>
+        <w:t>Created TypeScript-first CMS framework for content-driven products in Next.js</w:t>
       </w:r>
     </w:p>
     <w:p>
@@ -349,7 +234,7 @@
         <w:pStyle w:val="ListBullet"/>
       </w:pPr>
       <w:r>
-        <w:t>Built dual-mode content workflow with code-defined models and drag-and-drop visual builder</w:t>
+        <w:t>Developed dual-mode content workflow: code-defined models plus drag-and-drop visual builder</w:t>
       </w:r>
     </w:p>
     <w:p>
@@ -357,12 +242,7 @@
         <w:pStyle w:val="ListBullet"/>
       </w:pPr>
       <w:r>
-        <w:t>Implemented pluggable database adapters supporting MongoDB, PostgreSQL, MySQL, and SQLite</w:t>
-      </w:r>
-    </w:p>
-    <w:p>
-      <w:r>
-        <w:t>**21Century Equipment &amp; 4Rivers Equipment** | E-Commerce Platforms</w:t>
+        <w:t>Implemented RBAC with permissions for team content access</w:t>
       </w:r>
     </w:p>
     <w:p>
@@ -370,7 +250,12 @@
         <w:pStyle w:val="ListBullet"/>
       </w:pPr>
       <w:r>
-        <w:t>Developed B2B equipment management and enterprise e-commerce platforms using React.js, Redux Toolkit, and Stripe API</w:t>
+        <w:t>Built pluggable database adapters for PostgreSQL, MySQL, SQLite with zero code changes</w:t>
+      </w:r>
+    </w:p>
+    <w:p>
+      <w:r>
+        <w:t>**21Century Equipment** - B2B Equipment Management Platform</w:t>
       </w:r>
     </w:p>
     <w:p>
@@ -378,7 +263,7 @@
         <w:pStyle w:val="ListBullet"/>
       </w:pPr>
       <w:r>
-        <w:t>Integrated Google Maps API for location-based features</w:t>
+        <w:t>Developed full-stack application with Next.js, React, Redux Toolkit, Stripe, and Google Maps API</w:t>
       </w:r>
     </w:p>
     <w:p>
@@ -391,12 +276,15 @@
     </w:p>
     <w:p>
       <w:r>
-        <w:t>**BS in Computer Science** | University of Haripur</w:t>
+        <w:t>**BS in Computer Science** | University of Haripur | Aug 2020 - Aug 2024</w:t>
       </w:r>
     </w:p>
     <w:p>
+      <w:pPr>
+        <w:pStyle w:val="ListBullet"/>
+      </w:pPr>
       <w:r>
-        <w:t>Aug 2020 - Aug 2024 | Haripur, Pakistan</w:t>
+        <w:t>Haripur, Pakistan</w:t>
       </w:r>
     </w:p>
     <w:p>
@@ -408,6 +296,9 @@
       </w:r>
     </w:p>
     <w:p>
+      <w:pPr>
+        <w:pStyle w:val="ListBullet"/>
+      </w:pPr>
       <w:r>
         <w:t>English, Urdu</w:t>
       </w:r>

</xml_diff>

<commit_message>
ci: daily run 2026-10-05
</commit_message>
<xml_diff>
--- a/tailored/cv_appalachian-growth-solutions_full-stack-developer-mern-stack-ai-vibe-.docx
+++ b/tailored/cv_appalachian-growth-solutions_full-stack-developer-mern-stack-ai-vibe-.docx
@@ -17,7 +17,7 @@
     </w:p>
     <w:p>
       <w:r>
-        <w:t>muzzamilhassandev@gmail.com | +923055779207 | https://muzzamilhassandev.vercel.app/</w:t>
+        <w:t>📧 muzzamilhassandev@gmail.com | 📱 +923055779207 | 💼 https://www.linkedin.com/in/muzzamilhassann/ | 🌐 https://github.com/muzzamilhassan/ | 🖼️ https://muzzamilhassandev.vercel.app/</w:t>
       </w:r>
     </w:p>
     <w:p>
@@ -30,7 +30,7 @@
     </w:p>
     <w:p>
       <w:r>
-        <w:t>Full Stack Developer with expertise in building production-grade SaaS products using the MERN stack (MongoDB, Express.js, React.js, Node.js). Experienced in architecting and shipping end-to-end solutions with a focus on AI integration, responsive UIs, and scalable backend systems. Proficient in modern development practices, AI-assisted coding, and creating maintainable codebases.</w:t>
+        <w:t>Full Stack Developer with expertise in building production-grade web applications using MERN stack technologies. Proficient in architecting and shipping end-to-end SaaS products with React.js, Node.js, Express.js, and MongoDB. Experienced in AI-assisted development using LangChain, LangGraph, and OpenAI API to enhance productivity and explore innovative solutions. Skilled in creating responsive UIs, developing REST APIs, working with databases, and implementing clean, maintainable code with proper Git workflows.</w:t>
       </w:r>
     </w:p>
     <w:p>
@@ -42,51 +42,38 @@
       </w:r>
     </w:p>
     <w:p>
-      <w:pPr>
-        <w:pStyle w:val="ListBullet"/>
-      </w:pPr>
       <w:r>
-        <w:t>**Frontend**: React.js, Next.js, Redux Toolkit, TanStack Query, Tailwind CSS</w:t>
+        <w:t xml:space="preserve">**MERN Stack**: MongoDB, Express.js, React.js, Node.js  </w:t>
       </w:r>
     </w:p>
     <w:p>
-      <w:pPr>
-        <w:pStyle w:val="ListBullet"/>
-      </w:pPr>
       <w:r>
-        <w:t>**Backend**: Node.js, Express.js, NestJS, REST API Design, JWT/OAuth2 Authentication</w:t>
+        <w:t xml:space="preserve">**Frontend**: React.js, Next.js, Redux Toolkit, TanStack Query, Tailwind CSS  </w:t>
       </w:r>
     </w:p>
     <w:p>
-      <w:pPr>
-        <w:pStyle w:val="ListBullet"/>
-      </w:pPr>
       <w:r>
-        <w:t>**Databases**: MongoDB, PostgreSQL, MySQL, SQLite, Drizzle ORM, Firebase, Supabase</w:t>
+        <w:t xml:space="preserve">**Backend**: Node.js, Express.js, REST API Design, JWT/OAuth2 Authentication, RBAC  </w:t>
       </w:r>
     </w:p>
     <w:p>
-      <w:pPr>
-        <w:pStyle w:val="ListBullet"/>
-      </w:pPr>
       <w:r>
-        <w:t>**AI Integration**: LangChain, LangGraph, OpenAI API</w:t>
+        <w:t xml:space="preserve">**Databases**: MongoDB, PostgreSQL, MySQL, SQLite, Drizzle ORM, Firebase, Supabase  </w:t>
       </w:r>
     </w:p>
     <w:p>
-      <w:pPr>
-        <w:pStyle w:val="ListBullet"/>
-      </w:pPr>
       <w:r>
-        <w:t>**Development Tools**: Git, GitHub, Docker, Vercel, AWS Amplify</w:t>
+        <w:t xml:space="preserve">**AI Tools**: LangChain, LangGraph, OpenAI API  </w:t>
       </w:r>
     </w:p>
     <w:p>
-      <w:pPr>
-        <w:pStyle w:val="ListBullet"/>
-      </w:pPr>
       <w:r>
-        <w:t>**Practices**: Component architecture, SEO, a11y, Performance Optimization</w:t>
+        <w:t xml:space="preserve">**Development Tools**: Git, GitHub, Docker, Vercel (CI/CD), AWS Amplify  </w:t>
+      </w:r>
+    </w:p>
+    <w:p>
+      <w:r>
+        <w:t>**Additional**: TypeScript, HTML5, CSS3, Component Architecture, Performance Optimization, SEO, a11y</w:t>
       </w:r>
     </w:p>
     <w:p>
@@ -107,7 +94,7 @@
         <w:pStyle w:val="ListBullet"/>
       </w:pPr>
       <w:r>
-        <w:t>Architected and shipped production features for enterprise headless CMS using Next.js App Router, TypeScript, and TanStack Query</w:t>
+        <w:t>Architected and shipped production features for enterprise applications using React.js, Node.js, Express.js, and MongoDB</w:t>
       </w:r>
     </w:p>
     <w:p>
@@ -115,7 +102,7 @@
         <w:pStyle w:val="ListBullet"/>
       </w:pPr>
       <w:r>
-        <w:t>Owned full authentication and access control layer with JWT-based auth and flexible RBAC system</w:t>
+        <w:t>Developed and maintained REST APIs with JWT-based authentication and flexible RBAC systems</w:t>
       </w:r>
     </w:p>
     <w:p>
@@ -123,7 +110,7 @@
         <w:pStyle w:val="ListBullet"/>
       </w:pPr>
       <w:r>
-        <w:t>Designed and maintained pluggable multi-database adapter system supporting PostgreSQL, MySQL, SQLite</w:t>
+        <w:t>Designed pluggable multi-database adapter systems supporting MongoDB, PostgreSQL, MySQL, and SQLite</w:t>
       </w:r>
     </w:p>
     <w:p>
@@ -131,7 +118,7 @@
         <w:pStyle w:val="ListBullet"/>
       </w:pPr>
       <w:r>
-        <w:t>Optimized performance through SSR, caching, lazy loading, code splitting, and API improvements</w:t>
+        <w:t>Optimized application performance through SSR, caching, lazy loading, and code splitting</w:t>
       </w:r>
     </w:p>
     <w:p>
@@ -139,7 +126,7 @@
         <w:pStyle w:val="ListBullet"/>
       </w:pPr>
       <w:r>
-        <w:t>Built customizable admin dashboard for collections, media uploads, user roles, and system settings</w:t>
+        <w:t>Built responsive, pixel-perfect UIs with accessibility and SEO standards</w:t>
       </w:r>
     </w:p>
     <w:p>
@@ -147,7 +134,7 @@
         <w:pStyle w:val="ListBullet"/>
       </w:pPr>
       <w:r>
-        <w:t>Delivered pixel-perfect, responsive UIs with Tailwind CSS, strict a11y and SEO standards</w:t>
+        <w:t>Implemented AI-powered features using LangChain and OpenAI API for enhanced functionality</w:t>
       </w:r>
     </w:p>
     <w:p>
@@ -160,7 +147,7 @@
     </w:p>
     <w:p>
       <w:r>
-        <w:t>**RextAI** - AI-Powered Content Intelligence Platform</w:t>
+        <w:t>**RextAI** | AI-Powered Content Intelligence Platform</w:t>
       </w:r>
     </w:p>
     <w:p>
@@ -168,7 +155,7 @@
         <w:pStyle w:val="ListBullet"/>
       </w:pPr>
       <w:r>
-        <w:t>Built SaaS platform for AI-driven content generation, editing, and workflow automation</w:t>
+        <w:t>Built SaaS platform for AI-driven content generation and workflow automation using React.js, Node.js, and OpenAI API</w:t>
       </w:r>
     </w:p>
     <w:p>
@@ -176,7 +163,7 @@
         <w:pStyle w:val="ListBullet"/>
       </w:pPr>
       <w:r>
-        <w:t>Implemented AI article generation with keyword input, E-E-A-T optimization, and humanization layer</w:t>
+        <w:t>Implemented AI article generation with keyword input and optimization controls</w:t>
       </w:r>
     </w:p>
     <w:p>
@@ -184,7 +171,7 @@
         <w:pStyle w:val="ListBullet"/>
       </w:pPr>
       <w:r>
-        <w:t>Integrated CMS auto-publishing with WordPress, Webflow, and Ghost APIs using OAuth flows</w:t>
+        <w:t>Integrated CMS auto-publish functionality with WordPress, Webflow, and Ghost APIs using OAuth flows</w:t>
       </w:r>
     </w:p>
     <w:p>
@@ -192,12 +179,12 @@
         <w:pStyle w:val="ListBullet"/>
       </w:pPr>
       <w:r>
-        <w:t>Optimized frontend performance with SSR, caching, lazy loading, and code splitting</w:t>
+        <w:t>Optimized frontend performance with SSR, caching, and code splitting techniques</w:t>
       </w:r>
     </w:p>
     <w:p>
       <w:r>
-        <w:t>**HireIQ** - AI-Powered Recruitment &amp; Evaluation Platform</w:t>
+        <w:t>**HireIQ** | AI-Powered Recruitment &amp; Evaluation Platform</w:t>
       </w:r>
     </w:p>
     <w:p>
@@ -205,7 +192,7 @@
         <w:pStyle w:val="ListBullet"/>
       </w:pPr>
       <w:r>
-        <w:t>Developed AI-assisted recruitment and candidate evaluation platform end-to-end</w:t>
+        <w:t>Developed AI-assisted recruitment platform using React.js, Node.js, and LangChain</w:t>
       </w:r>
     </w:p>
     <w:p>
@@ -213,12 +200,12 @@
         <w:pStyle w:val="ListBullet"/>
       </w:pPr>
       <w:r>
-        <w:t>Implemented LangChain and LangGraph for AI-powered candidate analysis and matching</w:t>
+        <w:t>Implemented candidate evaluation system with AI-powered insights and recommendations</w:t>
       </w:r>
     </w:p>
     <w:p>
       <w:r>
-        <w:t>**Nextly** - Enterprise Headless CMS &amp; SaaS Framework</w:t>
+        <w:t>**Nextly** | Enterprise Headless CMS &amp; SaaS Framework</w:t>
       </w:r>
     </w:p>
     <w:p>
@@ -226,7 +213,7 @@
         <w:pStyle w:val="ListBullet"/>
       </w:pPr>
       <w:r>
-        <w:t>Created TypeScript-first CMS framework for content-driven products in Next.js</w:t>
+        <w:t>Created TypeScript-first CMS framework using Next.js, Node.js, and MongoDB</w:t>
       </w:r>
     </w:p>
     <w:p>
@@ -234,7 +221,7 @@
         <w:pStyle w:val="ListBullet"/>
       </w:pPr>
       <w:r>
-        <w:t>Developed dual-mode content workflow: code-defined models plus drag-and-drop visual builder</w:t>
+        <w:t>Implemented dual-mode content workflow with code-defined models and visual builder</w:t>
       </w:r>
     </w:p>
     <w:p>
@@ -242,7 +229,7 @@
         <w:pStyle w:val="ListBullet"/>
       </w:pPr>
       <w:r>
-        <w:t>Implemented RBAC with permissions for team content access</w:t>
+        <w:t>Developed pluggable database adapters for MongoDB, PostgreSQL, MySQL, and SQLite</w:t>
       </w:r>
     </w:p>
     <w:p>
@@ -250,12 +237,12 @@
         <w:pStyle w:val="ListBullet"/>
       </w:pPr>
       <w:r>
-        <w:t>Built pluggable database adapters for PostgreSQL, MySQL, SQLite with zero code changes</w:t>
+        <w:t>Built fully customizable admin dashboard with role-based access controls</w:t>
       </w:r>
     </w:p>
     <w:p>
       <w:r>
-        <w:t>**21Century Equipment** - B2B Equipment Management Platform</w:t>
+        <w:t>**21Century Equipment** | B2B Equipment Management Platform</w:t>
       </w:r>
     </w:p>
     <w:p>
@@ -263,7 +250,15 @@
         <w:pStyle w:val="ListBullet"/>
       </w:pPr>
       <w:r>
-        <w:t>Developed full-stack application with Next.js, React, Redux Toolkit, Stripe, and Google Maps API</w:t>
+        <w:t>Developed full-stack application using React.js, Node.js, Express.js, and MongoDB</w:t>
+      </w:r>
+    </w:p>
+    <w:p>
+      <w:pPr>
+        <w:pStyle w:val="ListBullet"/>
+      </w:pPr>
+      <w:r>
+        <w:t>Integrated Stripe payment processing and Google Maps API for location services</w:t>
       </w:r>
     </w:p>
     <w:p>
@@ -296,9 +291,6 @@
       </w:r>
     </w:p>
     <w:p>
-      <w:pPr>
-        <w:pStyle w:val="ListBullet"/>
-      </w:pPr>
       <w:r>
         <w:t>English, Urdu</w:t>
       </w:r>

</xml_diff>

<commit_message>
ci: daily run 2026-10-06
</commit_message>
<xml_diff>
--- a/tailored/cv_appalachian-growth-solutions_full-stack-developer-mern-stack-ai-vibe-.docx
+++ b/tailored/cv_appalachian-growth-solutions_full-stack-developer-mern-stack-ai-vibe-.docx
@@ -12,12 +12,17 @@
     </w:p>
     <w:p>
       <w:r>
-        <w:t>Full Stack Developer (MERN / PERN / Next.js - SaaS) | Islamabad, Pakistan</w:t>
+        <w:t>Full Stack Developer (MERN / PERN / Next.js - SaaS) | AI &amp; Vibe Coding Experience</w:t>
       </w:r>
     </w:p>
     <w:p>
       <w:r>
-        <w:t>📧 muzzamilhassandev@gmail.com | 📱 +923055779207 | 💼 https://www.linkedin.com/in/muzzamilhassann/ | 🌐 https://github.com/muzzamilhassan/ | 🖼️ https://muzzamilhassandev.vercel.app/</w:t>
+        <w:t xml:space="preserve">**Contact:** muzzamilhassandev@gmail.com | +923055779207 | Islamabad, Pakistan  </w:t>
+      </w:r>
+    </w:p>
+    <w:p>
+      <w:r>
+        <w:t>**LinkedIn:** https://www.linkedin.com/in/muzzamilhassann/ | **GitHub:** https://github.com/muzzamilhassan/ | **Portfolio:** https://muzzamilhassandev.vercel.app/</w:t>
       </w:r>
     </w:p>
     <w:p>
@@ -25,12 +30,12 @@
         <w:pStyle w:val="Heading2"/>
       </w:pPr>
       <w:r>
-        <w:t>PROFESSIONAL SUMMARY</w:t>
+        <w:t>Professional Summary</w:t>
       </w:r>
     </w:p>
     <w:p>
       <w:r>
-        <w:t>Full Stack Developer with expertise in building production-grade web applications using MERN stack technologies. Proficient in architecting and shipping end-to-end SaaS products with React.js, Node.js, Express.js, and MongoDB. Experienced in AI-assisted development using LangChain, LangGraph, and OpenAI API to enhance productivity and explore innovative solutions. Skilled in creating responsive UIs, developing REST APIs, working with databases, and implementing clean, maintainable code with proper Git workflows.</w:t>
+        <w:t>Full Stack Developer with expertise in the MERN stack (MongoDB, Express.js, React.js, Node.js) and AI-assisted development. Experienced in building production-grade SaaS applications from the ground up, with a strong focus on creating responsive UIs, scalable REST APIs, and efficient database solutions. Proficient in using modern AI tools like LangChain, LangGraph, and OpenAI API to accelerate development, explore ideas, debug code, and build prototypes while maintaining the ability to review, modify, and maintain AI-generated code.</w:t>
       </w:r>
     </w:p>
     <w:p>
@@ -38,42 +43,183 @@
         <w:pStyle w:val="Heading2"/>
       </w:pPr>
       <w:r>
-        <w:t>TECHNICAL SKILLS</w:t>
+        <w:t>Skills</w:t>
       </w:r>
     </w:p>
     <w:p>
+      <w:pPr>
+        <w:pStyle w:val="Heading3"/>
+      </w:pPr>
       <w:r>
-        <w:t xml:space="preserve">**MERN Stack**: MongoDB, Express.js, React.js, Node.js  </w:t>
+        <w:t>Frontend Development</w:t>
       </w:r>
     </w:p>
     <w:p>
+      <w:pPr>
+        <w:pStyle w:val="ListBullet"/>
+      </w:pPr>
       <w:r>
-        <w:t xml:space="preserve">**Frontend**: React.js, Next.js, Redux Toolkit, TanStack Query, Tailwind CSS  </w:t>
+        <w:t>React.js, Next.js (App Router, Server Components, SSR/ISR)</w:t>
       </w:r>
     </w:p>
     <w:p>
+      <w:pPr>
+        <w:pStyle w:val="ListBullet"/>
+      </w:pPr>
       <w:r>
-        <w:t xml:space="preserve">**Backend**: Node.js, Express.js, REST API Design, JWT/OAuth2 Authentication, RBAC  </w:t>
+        <w:t>Redux Toolkit, TanStack Query</w:t>
       </w:r>
     </w:p>
     <w:p>
+      <w:pPr>
+        <w:pStyle w:val="ListBullet"/>
+      </w:pPr>
       <w:r>
-        <w:t xml:space="preserve">**Databases**: MongoDB, PostgreSQL, MySQL, SQLite, Drizzle ORM, Firebase, Supabase  </w:t>
+        <w:t>HTML5, CSS3, Tailwind CSS</w:t>
       </w:r>
     </w:p>
     <w:p>
+      <w:pPr>
+        <w:pStyle w:val="ListBullet"/>
+      </w:pPr>
       <w:r>
-        <w:t xml:space="preserve">**AI Tools**: LangChain, LangGraph, OpenAI API  </w:t>
+        <w:t>Responsive design, Performance optimization, SEO, a11y</w:t>
       </w:r>
     </w:p>
     <w:p>
+      <w:pPr>
+        <w:pStyle w:val="Heading3"/>
+      </w:pPr>
       <w:r>
-        <w:t xml:space="preserve">**Development Tools**: Git, GitHub, Docker, Vercel (CI/CD), AWS Amplify  </w:t>
+        <w:t>Backend Development</w:t>
       </w:r>
     </w:p>
     <w:p>
+      <w:pPr>
+        <w:pStyle w:val="ListBullet"/>
+      </w:pPr>
       <w:r>
-        <w:t>**Additional**: TypeScript, HTML5, CSS3, Component Architecture, Performance Optimization, SEO, a11y</w:t>
+        <w:t>Node.js, Express.js, NestJS</w:t>
+      </w:r>
+    </w:p>
+    <w:p>
+      <w:pPr>
+        <w:pStyle w:val="ListBullet"/>
+      </w:pPr>
+      <w:r>
+        <w:t>REST API Design</w:t>
+      </w:r>
+    </w:p>
+    <w:p>
+      <w:pPr>
+        <w:pStyle w:val="ListBullet"/>
+      </w:pPr>
+      <w:r>
+        <w:t>JWT / OAuth2 Authentication</w:t>
+      </w:r>
+    </w:p>
+    <w:p>
+      <w:pPr>
+        <w:pStyle w:val="ListBullet"/>
+      </w:pPr>
+      <w:r>
+        <w:t>RBAC (Role-Based Access Control)</w:t>
+      </w:r>
+    </w:p>
+    <w:p>
+      <w:pPr>
+        <w:pStyle w:val="Heading3"/>
+      </w:pPr>
+      <w:r>
+        <w:t>Database Technologies</w:t>
+      </w:r>
+    </w:p>
+    <w:p>
+      <w:pPr>
+        <w:pStyle w:val="ListBullet"/>
+      </w:pPr>
+      <w:r>
+        <w:t>MongoDB, PostgreSQL, MySQL, SQLite</w:t>
+      </w:r>
+    </w:p>
+    <w:p>
+      <w:pPr>
+        <w:pStyle w:val="ListBullet"/>
+      </w:pPr>
+      <w:r>
+        <w:t>Drizzle ORM, Firebase, Supabase</w:t>
+      </w:r>
+    </w:p>
+    <w:p>
+      <w:pPr>
+        <w:pStyle w:val="Heading3"/>
+      </w:pPr>
+      <w:r>
+        <w:t>AI &amp; Machine Learning</w:t>
+      </w:r>
+    </w:p>
+    <w:p>
+      <w:pPr>
+        <w:pStyle w:val="ListBullet"/>
+      </w:pPr>
+      <w:r>
+        <w:t>LangChain, LangGraph</w:t>
+      </w:r>
+    </w:p>
+    <w:p>
+      <w:pPr>
+        <w:pStyle w:val="ListBullet"/>
+      </w:pPr>
+      <w:r>
+        <w:t>OpenAI API integration</w:t>
+      </w:r>
+    </w:p>
+    <w:p>
+      <w:pPr>
+        <w:pStyle w:val="ListBullet"/>
+      </w:pPr>
+      <w:r>
+        <w:t>AI-powered content generation and workflow automation</w:t>
+      </w:r>
+    </w:p>
+    <w:p>
+      <w:pPr>
+        <w:pStyle w:val="Heading3"/>
+      </w:pPr>
+      <w:r>
+        <w:t>Development Tools &amp; Practices</w:t>
+      </w:r>
+    </w:p>
+    <w:p>
+      <w:pPr>
+        <w:pStyle w:val="ListBullet"/>
+      </w:pPr>
+      <w:r>
+        <w:t>Git, GitHub, Bitbucket</w:t>
+      </w:r>
+    </w:p>
+    <w:p>
+      <w:pPr>
+        <w:pStyle w:val="ListBullet"/>
+      </w:pPr>
+      <w:r>
+        <w:t>Docker, Vercel (CI/CD, Edge Functions)</w:t>
+      </w:r>
+    </w:p>
+    <w:p>
+      <w:pPr>
+        <w:pStyle w:val="ListBullet"/>
+      </w:pPr>
+      <w:r>
+        <w:t>AWS Amplify, GitHub Actions</w:t>
+      </w:r>
+    </w:p>
+    <w:p>
+      <w:pPr>
+        <w:pStyle w:val="ListBullet"/>
+      </w:pPr>
+      <w:r>
+        <w:t>Component architecture, Code splitting, Lazy loading</w:t>
       </w:r>
     </w:p>
     <w:p>
@@ -81,12 +227,20 @@
         <w:pStyle w:val="Heading2"/>
       </w:pPr>
       <w:r>
-        <w:t>PROFESSIONAL EXPERIENCE</w:t>
+        <w:t>Experience</w:t>
+      </w:r>
+    </w:p>
+    <w:p>
+      <w:pPr>
+        <w:pStyle w:val="Heading3"/>
+      </w:pPr>
+      <w:r>
+        <w:t>Full Stack Developer | Revnix (fmr. Revnix Technologies)</w:t>
       </w:r>
     </w:p>
     <w:p>
       <w:r>
-        <w:t>**Full Stack Developer** | Revnix (fmr. Revnix Technologies) | Jan 2025 - Present</w:t>
+        <w:t>*Jan 2025 - Present | Islamabad, Pakistan*</w:t>
       </w:r>
     </w:p>
     <w:p>
@@ -94,7 +248,7 @@
         <w:pStyle w:val="ListBullet"/>
       </w:pPr>
       <w:r>
-        <w:t>Architected and shipped production features for enterprise applications using React.js, Node.js, Express.js, and MongoDB</w:t>
+        <w:t>Architected and shipped production features for an enterprise headless CMS (Nextly) using Next.js App Router, TypeScript, and TanStack Query</w:t>
       </w:r>
     </w:p>
     <w:p>
@@ -102,7 +256,7 @@
         <w:pStyle w:val="ListBullet"/>
       </w:pPr>
       <w:r>
-        <w:t>Developed and maintained REST APIs with JWT-based authentication and flexible RBAC systems</w:t>
+        <w:t>Owned the full authentication and access control layer: JWT-based auth and a flexible RBAC system supporting multiple user roles</w:t>
       </w:r>
     </w:p>
     <w:p>
@@ -110,7 +264,7 @@
         <w:pStyle w:val="ListBullet"/>
       </w:pPr>
       <w:r>
-        <w:t>Designed pluggable multi-database adapter systems supporting MongoDB, PostgreSQL, MySQL, and SQLite</w:t>
+        <w:t>Designed and maintained a pluggable multi-database adapter system (PostgreSQL, MySQL, SQLite)</w:t>
       </w:r>
     </w:p>
     <w:p>
@@ -118,7 +272,7 @@
         <w:pStyle w:val="ListBullet"/>
       </w:pPr>
       <w:r>
-        <w:t>Optimized application performance through SSR, caching, lazy loading, and code splitting</w:t>
+        <w:t>Optimized performance and UX through SSR, caching, lazy loading, code splitting, and API improvements</w:t>
       </w:r>
     </w:p>
     <w:p>
@@ -126,7 +280,7 @@
         <w:pStyle w:val="ListBullet"/>
       </w:pPr>
       <w:r>
-        <w:t>Built responsive, pixel-perfect UIs with accessibility and SEO standards</w:t>
+        <w:t>Built a fully customizable admin dashboard for collections, media uploads, user roles, and system settings</w:t>
       </w:r>
     </w:p>
     <w:p>
@@ -134,7 +288,7 @@
         <w:pStyle w:val="ListBullet"/>
       </w:pPr>
       <w:r>
-        <w:t>Implemented AI-powered features using LangChain and OpenAI API for enhanced functionality</w:t>
+        <w:t>Delivered pixel-perfect, responsive UIs from Figma designs with Tailwind CSS, strict a11y and SEO standards</w:t>
       </w:r>
     </w:p>
     <w:p>
@@ -142,12 +296,15 @@
         <w:pStyle w:val="Heading2"/>
       </w:pPr>
       <w:r>
-        <w:t>KEY PROJECTS</w:t>
+        <w:t>Projects</w:t>
       </w:r>
     </w:p>
     <w:p>
+      <w:pPr>
+        <w:pStyle w:val="Heading3"/>
+      </w:pPr>
       <w:r>
-        <w:t>**RextAI** | AI-Powered Content Intelligence Platform</w:t>
+        <w:t>RextAI | AI-Powered Content Intelligence Platform</w:t>
       </w:r>
     </w:p>
     <w:p>
@@ -155,7 +312,7 @@
         <w:pStyle w:val="ListBullet"/>
       </w:pPr>
       <w:r>
-        <w:t>Built SaaS platform for AI-driven content generation and workflow automation using React.js, Node.js, and OpenAI API</w:t>
+        <w:t>SaaS platform for AI-driven content generation, editing, and workflow automation</w:t>
       </w:r>
     </w:p>
     <w:p>
@@ -163,7 +320,7 @@
         <w:pStyle w:val="ListBullet"/>
       </w:pPr>
       <w:r>
-        <w:t>Implemented AI article generation with keyword input and optimization controls</w:t>
+        <w:t>AI article generation editor with keyword input, E-E-A-T optimization controls, and humanization layer</w:t>
       </w:r>
     </w:p>
     <w:p>
@@ -171,7 +328,7 @@
         <w:pStyle w:val="ListBullet"/>
       </w:pPr>
       <w:r>
-        <w:t>Integrated CMS auto-publish functionality with WordPress, Webflow, and Ghost APIs using OAuth flows</w:t>
+        <w:t>One-click CMS auto-publish integrating WordPress, Webflow, and Ghost APIs with OAuth flows</w:t>
       </w:r>
     </w:p>
     <w:p>
@@ -179,12 +336,7 @@
         <w:pStyle w:val="ListBullet"/>
       </w:pPr>
       <w:r>
-        <w:t>Optimized frontend performance with SSR, caching, and code splitting techniques</w:t>
-      </w:r>
-    </w:p>
-    <w:p>
-      <w:r>
-        <w:t>**HireIQ** | AI-Powered Recruitment &amp; Evaluation Platform</w:t>
+        <w:t>Frontend performance via SSR, caching, lazy loading, code splitting</w:t>
       </w:r>
     </w:p>
     <w:p>
@@ -192,7 +344,15 @@
         <w:pStyle w:val="ListBullet"/>
       </w:pPr>
       <w:r>
-        <w:t>Developed AI-assisted recruitment platform using React.js, Node.js, and LangChain</w:t>
+        <w:t>**Tech Stack:** Next.js, React.js, TypeScript, Node.js, LangChain, LangGraph, OpenAI API, Tailwind CSS</w:t>
+      </w:r>
+    </w:p>
+    <w:p>
+      <w:pPr>
+        <w:pStyle w:val="Heading3"/>
+      </w:pPr>
+      <w:r>
+        <w:t>HireIQ | AI-Powered Recruitment &amp; Evaluation Platform</w:t>
       </w:r>
     </w:p>
     <w:p>
@@ -200,12 +360,7 @@
         <w:pStyle w:val="ListBullet"/>
       </w:pPr>
       <w:r>
-        <w:t>Implemented candidate evaluation system with AI-powered insights and recommendations</w:t>
-      </w:r>
-    </w:p>
-    <w:p>
-      <w:r>
-        <w:t>**Nextly** | Enterprise Headless CMS &amp; SaaS Framework</w:t>
+        <w:t>AI-assisted recruitment and candidate evaluation platform built end-to-end</w:t>
       </w:r>
     </w:p>
     <w:p>
@@ -213,7 +368,15 @@
         <w:pStyle w:val="ListBullet"/>
       </w:pPr>
       <w:r>
-        <w:t>Created TypeScript-first CMS framework using Next.js, Node.js, and MongoDB</w:t>
+        <w:t>**Tech Stack:** Next.js, React, TypeScript, Node.js, LangChain, LangGraph, OpenAI API, Tailwind CSS</w:t>
+      </w:r>
+    </w:p>
+    <w:p>
+      <w:pPr>
+        <w:pStyle w:val="Heading3"/>
+      </w:pPr>
+      <w:r>
+        <w:t>Nextly | Enterprise Headless CMS &amp; SaaS Framework</w:t>
       </w:r>
     </w:p>
     <w:p>
@@ -221,7 +384,7 @@
         <w:pStyle w:val="ListBullet"/>
       </w:pPr>
       <w:r>
-        <w:t>Implemented dual-mode content workflow with code-defined models and visual builder</w:t>
+        <w:t>TypeScript-first CMS framework for content-driven products inside Next.js</w:t>
       </w:r>
     </w:p>
     <w:p>
@@ -229,7 +392,7 @@
         <w:pStyle w:val="ListBullet"/>
       </w:pPr>
       <w:r>
-        <w:t>Developed pluggable database adapters for MongoDB, PostgreSQL, MySQL, and SQLite</w:t>
+        <w:t>Dual-mode content workflow: code-defined models plus drag-and-drop visual builder with instant preview</w:t>
       </w:r>
     </w:p>
     <w:p>
@@ -237,12 +400,7 @@
         <w:pStyle w:val="ListBullet"/>
       </w:pPr>
       <w:r>
-        <w:t>Built fully customizable admin dashboard with role-based access controls</w:t>
-      </w:r>
-    </w:p>
-    <w:p>
-      <w:r>
-        <w:t>**21Century Equipment** | B2B Equipment Management Platform</w:t>
+        <w:t>RBAC with permissions for team content access</w:t>
       </w:r>
     </w:p>
     <w:p>
@@ -250,7 +408,7 @@
         <w:pStyle w:val="ListBullet"/>
       </w:pPr>
       <w:r>
-        <w:t>Developed full-stack application using React.js, Node.js, Express.js, and MongoDB</w:t>
+        <w:t>PostgreSQL, MySQL, SQLite via pluggable Drizzle ORM adapters</w:t>
       </w:r>
     </w:p>
     <w:p>
@@ -258,7 +416,31 @@
         <w:pStyle w:val="ListBullet"/>
       </w:pPr>
       <w:r>
-        <w:t>Integrated Stripe payment processing and Google Maps API for location services</w:t>
+        <w:t>**Tech Stack:** Next.js, TypeScript, Drizzle ORM, Node.js, TanStack Query, Docker, Monorepo</w:t>
+      </w:r>
+    </w:p>
+    <w:p>
+      <w:pPr>
+        <w:pStyle w:val="Heading3"/>
+      </w:pPr>
+      <w:r>
+        <w:t>21Century Equipment &amp; 4Rivers Equipment | E-Commerce &amp; Rental Platforms</w:t>
+      </w:r>
+    </w:p>
+    <w:p>
+      <w:pPr>
+        <w:pStyle w:val="ListBullet"/>
+      </w:pPr>
+      <w:r>
+        <w:t>B2B equipment management and enterprise e-commerce platforms</w:t>
+      </w:r>
+    </w:p>
+    <w:p>
+      <w:pPr>
+        <w:pStyle w:val="ListBullet"/>
+      </w:pPr>
+      <w:r>
+        <w:t>**Tech Stack:** Next.js, React, Redux Toolkit, Stripe, Google Maps API</w:t>
       </w:r>
     </w:p>
     <w:p>
@@ -266,20 +448,25 @@
         <w:pStyle w:val="Heading2"/>
       </w:pPr>
       <w:r>
-        <w:t>EDUCATION</w:t>
+        <w:t>Education</w:t>
+      </w:r>
+    </w:p>
+    <w:p>
+      <w:pPr>
+        <w:pStyle w:val="Heading3"/>
+      </w:pPr>
+      <w:r>
+        <w:t>Bachelor of Science in Computer Science</w:t>
       </w:r>
     </w:p>
     <w:p>
       <w:r>
-        <w:t>**BS in Computer Science** | University of Haripur | Aug 2020 - Aug 2024</w:t>
+        <w:t>*University of Haripur | Haripur, Pakistan*</w:t>
       </w:r>
     </w:p>
     <w:p>
-      <w:pPr>
-        <w:pStyle w:val="ListBullet"/>
-      </w:pPr>
       <w:r>
-        <w:t>Haripur, Pakistan</w:t>
+        <w:t>*Aug 2020 - Aug 2024*</w:t>
       </w:r>
     </w:p>
     <w:p>
@@ -287,10 +474,13 @@
         <w:pStyle w:val="Heading2"/>
       </w:pPr>
       <w:r>
-        <w:t>LANGUAGES</w:t>
+        <w:t>Languages</w:t>
       </w:r>
     </w:p>
     <w:p>
+      <w:pPr>
+        <w:pStyle w:val="ListBullet"/>
+      </w:pPr>
       <w:r>
         <w:t>English, Urdu</w:t>
       </w:r>

</xml_diff>

<commit_message>
ci: daily run 2026-10-07
</commit_message>
<xml_diff>
--- a/tailored/cv_appalachian-growth-solutions_full-stack-developer-mern-stack-ai-vibe-.docx
+++ b/tailored/cv_appalachian-growth-solutions_full-stack-developer-mern-stack-ai-vibe-.docx
@@ -12,17 +12,12 @@
     </w:p>
     <w:p>
       <w:r>
-        <w:t>Full Stack Developer (MERN / PERN / Next.js - SaaS) | AI &amp; Vibe Coding Experience</w:t>
+        <w:t>Full Stack Developer (MERN / PERN / Next.js - SaaS) | Islamabad, Pakistan</w:t>
       </w:r>
     </w:p>
     <w:p>
       <w:r>
-        <w:t xml:space="preserve">**Contact:** muzzamilhassandev@gmail.com | +923055779207 | Islamabad, Pakistan  </w:t>
-      </w:r>
-    </w:p>
-    <w:p>
-      <w:r>
-        <w:t>**LinkedIn:** https://www.linkedin.com/in/muzzamilhassann/ | **GitHub:** https://github.com/muzzamilhassan/ | **Portfolio:** https://muzzamilhassandev.vercel.app/</w:t>
+        <w:t>**Email:** muzzamilhassandev@gmail.com | **Phone:** +923055779207 | **LinkedIn:** https://www.linkedin.com/in/muzzamilhassann/ | **GitHub:** https://github.com/muzzamilhassan/ | **Portfolio:** https://muzzamilhassandev.vercel.app/</w:t>
       </w:r>
     </w:p>
     <w:p>
@@ -30,12 +25,12 @@
         <w:pStyle w:val="Heading2"/>
       </w:pPr>
       <w:r>
-        <w:t>Professional Summary</w:t>
+        <w:t>Summary</w:t>
       </w:r>
     </w:p>
     <w:p>
       <w:r>
-        <w:t>Full Stack Developer with expertise in the MERN stack (MongoDB, Express.js, React.js, Node.js) and AI-assisted development. Experienced in building production-grade SaaS applications from the ground up, with a strong focus on creating responsive UIs, scalable REST APIs, and efficient database solutions. Proficient in using modern AI tools like LangChain, LangGraph, and OpenAI API to accelerate development, explore ideas, debug code, and build prototypes while maintaining the ability to review, modify, and maintain AI-generated code.</w:t>
+        <w:t>Full Stack Developer with extensive experience building production-grade SaaS products using the MERN stack (MongoDB, Express.js, React.js, Node.js). Proficient in both frontend and backend development, with expertise in creating responsive UIs, developing REST APIs, and working with databases. Strong background in AI-assisted development using LangChain, LangGraph, and OpenAI API to accelerate development workflows while maintaining code quality and maintainability.</w:t>
       </w:r>
     </w:p>
     <w:p>
@@ -48,10 +43,10 @@
     </w:p>
     <w:p>
       <w:pPr>
-        <w:pStyle w:val="Heading3"/>
+        <w:pStyle w:val="ListBullet"/>
       </w:pPr>
       <w:r>
-        <w:t>Frontend Development</w:t>
+        <w:t>**Languages:** HTML5, CSS3, JavaScript (ES6+), TypeScript</w:t>
       </w:r>
     </w:p>
     <w:p>
@@ -59,7 +54,7 @@
         <w:pStyle w:val="ListBullet"/>
       </w:pPr>
       <w:r>
-        <w:t>React.js, Next.js (App Router, Server Components, SSR/ISR)</w:t>
+        <w:t>**Frontend:** React.js, Next.js, Redux Toolkit, TanStack Query, Tailwind CSS</w:t>
       </w:r>
     </w:p>
     <w:p>
@@ -67,7 +62,7 @@
         <w:pStyle w:val="ListBullet"/>
       </w:pPr>
       <w:r>
-        <w:t>Redux Toolkit, TanStack Query</w:t>
+        <w:t>**Backend:** Node.js, Express.js, NestJS, REST API Design, JWT/OAuth2 Authentication, RBAC</w:t>
       </w:r>
     </w:p>
     <w:p>
@@ -75,7 +70,7 @@
         <w:pStyle w:val="ListBullet"/>
       </w:pPr>
       <w:r>
-        <w:t>HTML5, CSS3, Tailwind CSS</w:t>
+        <w:t>**Databases:** MongoDB, PostgreSQL, MySQL, SQLite, Drizzle ORM, Firebase, Supabase</w:t>
       </w:r>
     </w:p>
     <w:p>
@@ -83,15 +78,7 @@
         <w:pStyle w:val="ListBullet"/>
       </w:pPr>
       <w:r>
-        <w:t>Responsive design, Performance optimization, SEO, a11y</w:t>
-      </w:r>
-    </w:p>
-    <w:p>
-      <w:pPr>
-        <w:pStyle w:val="Heading3"/>
-      </w:pPr>
-      <w:r>
-        <w:t>Backend Development</w:t>
+        <w:t>**AI Development:** LangChain, LangGraph, OpenAI API</w:t>
       </w:r>
     </w:p>
     <w:p>
@@ -99,7 +86,20 @@
         <w:pStyle w:val="ListBullet"/>
       </w:pPr>
       <w:r>
-        <w:t>Node.js, Express.js, NestJS</w:t>
+        <w:t>**Tools &amp; Practices:** Git, GitHub, Docker, Component Architecture, Lazy Loading, Code Splitting, SEO, a11y, Performance Optimization</w:t>
+      </w:r>
+    </w:p>
+    <w:p>
+      <w:pPr>
+        <w:pStyle w:val="Heading2"/>
+      </w:pPr>
+      <w:r>
+        <w:t>Professional Experience</w:t>
+      </w:r>
+    </w:p>
+    <w:p>
+      <w:r>
+        <w:t>**Full Stack Developer** | Revnix (fmr. Revnix Technologies) | Jan 2025 - Present</w:t>
       </w:r>
     </w:p>
     <w:p>
@@ -107,7 +107,7 @@
         <w:pStyle w:val="ListBullet"/>
       </w:pPr>
       <w:r>
-        <w:t>REST API Design</w:t>
+        <w:t>Architected and shipped production features for enterprise applications using React.js, Node.js, Express.js, and MongoDB</w:t>
       </w:r>
     </w:p>
     <w:p>
@@ -115,7 +115,7 @@
         <w:pStyle w:val="ListBullet"/>
       </w:pPr>
       <w:r>
-        <w:t>JWT / OAuth2 Authentication</w:t>
+        <w:t>Developed and maintained REST APIs with JWT-based authentication and flexible RBAC systems</w:t>
       </w:r>
     </w:p>
     <w:p>
@@ -123,15 +123,7 @@
         <w:pStyle w:val="ListBullet"/>
       </w:pPr>
       <w:r>
-        <w:t>RBAC (Role-Based Access Control)</w:t>
-      </w:r>
-    </w:p>
-    <w:p>
-      <w:pPr>
-        <w:pStyle w:val="Heading3"/>
-      </w:pPr>
-      <w:r>
-        <w:t>Database Technologies</w:t>
+        <w:t>Designed and implemented database solutions with MongoDB and other database systems</w:t>
       </w:r>
     </w:p>
     <w:p>
@@ -139,7 +131,7 @@
         <w:pStyle w:val="ListBullet"/>
       </w:pPr>
       <w:r>
-        <w:t>MongoDB, PostgreSQL, MySQL, SQLite</w:t>
+        <w:t>Built responsive, user-friendly frontend interfaces with React.js and Tailwind CSS</w:t>
       </w:r>
     </w:p>
     <w:p>
@@ -147,15 +139,7 @@
         <w:pStyle w:val="ListBullet"/>
       </w:pPr>
       <w:r>
-        <w:t>Drizzle ORM, Firebase, Supabase</w:t>
-      </w:r>
-    </w:p>
-    <w:p>
-      <w:pPr>
-        <w:pStyle w:val="Heading3"/>
-      </w:pPr>
-      <w:r>
-        <w:t>AI &amp; Machine Learning</w:t>
+        <w:t>Optimized application performance through SSR, caching, lazy loading, and code splitting</w:t>
       </w:r>
     </w:p>
     <w:p>
@@ -163,7 +147,7 @@
         <w:pStyle w:val="ListBullet"/>
       </w:pPr>
       <w:r>
-        <w:t>LangChain, LangGraph</w:t>
+        <w:t>Utilized AI tools (LangChain, LangGraph, OpenAI API) to accelerate development workflows and prototype new features</w:t>
       </w:r>
     </w:p>
     <w:p>
@@ -171,124 +155,7 @@
         <w:pStyle w:val="ListBullet"/>
       </w:pPr>
       <w:r>
-        <w:t>OpenAI API integration</w:t>
-      </w:r>
-    </w:p>
-    <w:p>
-      <w:pPr>
-        <w:pStyle w:val="ListBullet"/>
-      </w:pPr>
-      <w:r>
-        <w:t>AI-powered content generation and workflow automation</w:t>
-      </w:r>
-    </w:p>
-    <w:p>
-      <w:pPr>
-        <w:pStyle w:val="Heading3"/>
-      </w:pPr>
-      <w:r>
-        <w:t>Development Tools &amp; Practices</w:t>
-      </w:r>
-    </w:p>
-    <w:p>
-      <w:pPr>
-        <w:pStyle w:val="ListBullet"/>
-      </w:pPr>
-      <w:r>
-        <w:t>Git, GitHub, Bitbucket</w:t>
-      </w:r>
-    </w:p>
-    <w:p>
-      <w:pPr>
-        <w:pStyle w:val="ListBullet"/>
-      </w:pPr>
-      <w:r>
-        <w:t>Docker, Vercel (CI/CD, Edge Functions)</w:t>
-      </w:r>
-    </w:p>
-    <w:p>
-      <w:pPr>
-        <w:pStyle w:val="ListBullet"/>
-      </w:pPr>
-      <w:r>
-        <w:t>AWS Amplify, GitHub Actions</w:t>
-      </w:r>
-    </w:p>
-    <w:p>
-      <w:pPr>
-        <w:pStyle w:val="ListBullet"/>
-      </w:pPr>
-      <w:r>
-        <w:t>Component architecture, Code splitting, Lazy loading</w:t>
-      </w:r>
-    </w:p>
-    <w:p>
-      <w:pPr>
-        <w:pStyle w:val="Heading2"/>
-      </w:pPr>
-      <w:r>
-        <w:t>Experience</w:t>
-      </w:r>
-    </w:p>
-    <w:p>
-      <w:pPr>
-        <w:pStyle w:val="Heading3"/>
-      </w:pPr>
-      <w:r>
-        <w:t>Full Stack Developer | Revnix (fmr. Revnix Technologies)</w:t>
-      </w:r>
-    </w:p>
-    <w:p>
-      <w:r>
-        <w:t>*Jan 2025 - Present | Islamabad, Pakistan*</w:t>
-      </w:r>
-    </w:p>
-    <w:p>
-      <w:pPr>
-        <w:pStyle w:val="ListBullet"/>
-      </w:pPr>
-      <w:r>
-        <w:t>Architected and shipped production features for an enterprise headless CMS (Nextly) using Next.js App Router, TypeScript, and TanStack Query</w:t>
-      </w:r>
-    </w:p>
-    <w:p>
-      <w:pPr>
-        <w:pStyle w:val="ListBullet"/>
-      </w:pPr>
-      <w:r>
-        <w:t>Owned the full authentication and access control layer: JWT-based auth and a flexible RBAC system supporting multiple user roles</w:t>
-      </w:r>
-    </w:p>
-    <w:p>
-      <w:pPr>
-        <w:pStyle w:val="ListBullet"/>
-      </w:pPr>
-      <w:r>
-        <w:t>Designed and maintained a pluggable multi-database adapter system (PostgreSQL, MySQL, SQLite)</w:t>
-      </w:r>
-    </w:p>
-    <w:p>
-      <w:pPr>
-        <w:pStyle w:val="ListBullet"/>
-      </w:pPr>
-      <w:r>
-        <w:t>Optimized performance and UX through SSR, caching, lazy loading, code splitting, and API improvements</w:t>
-      </w:r>
-    </w:p>
-    <w:p>
-      <w:pPr>
-        <w:pStyle w:val="ListBullet"/>
-      </w:pPr>
-      <w:r>
-        <w:t>Built a fully customizable admin dashboard for collections, media uploads, user roles, and system settings</w:t>
-      </w:r>
-    </w:p>
-    <w:p>
-      <w:pPr>
-        <w:pStyle w:val="ListBullet"/>
-      </w:pPr>
-      <w:r>
-        <w:t>Delivered pixel-perfect, responsive UIs from Figma designs with Tailwind CSS, strict a11y and SEO standards</w:t>
+        <w:t>Collaborated with team members using Git/GitHub following proper development workflows</w:t>
       </w:r>
     </w:p>
     <w:p>
@@ -300,11 +167,8 @@
       </w:r>
     </w:p>
     <w:p>
-      <w:pPr>
-        <w:pStyle w:val="Heading3"/>
-      </w:pPr>
       <w:r>
-        <w:t>RextAI | AI-Powered Content Intelligence Platform</w:t>
+        <w:t>**RextAI** | AI-Powered Content Intelligence Platform</w:t>
       </w:r>
     </w:p>
     <w:p>
@@ -312,7 +176,7 @@
         <w:pStyle w:val="ListBullet"/>
       </w:pPr>
       <w:r>
-        <w:t>SaaS platform for AI-driven content generation, editing, and workflow automation</w:t>
+        <w:t>Built a SaaS platform for AI-driven content generation and workflow automation using React.js, Node.js, and OpenAI API</w:t>
       </w:r>
     </w:p>
     <w:p>
@@ -320,7 +184,7 @@
         <w:pStyle w:val="ListBullet"/>
       </w:pPr>
       <w:r>
-        <w:t>AI article generation editor with keyword input, E-E-A-T optimization controls, and humanization layer</w:t>
+        <w:t>Implemented AI article generation with keyword input and E-E-A-T optimization controls</w:t>
       </w:r>
     </w:p>
     <w:p>
@@ -328,7 +192,7 @@
         <w:pStyle w:val="ListBullet"/>
       </w:pPr>
       <w:r>
-        <w:t>One-click CMS auto-publish integrating WordPress, Webflow, and Ghost APIs with OAuth flows</w:t>
+        <w:t>Integrated AI-assisted development tools to accelerate feature implementation and prototyping</w:t>
       </w:r>
     </w:p>
     <w:p>
@@ -336,7 +200,12 @@
         <w:pStyle w:val="ListBullet"/>
       </w:pPr>
       <w:r>
-        <w:t>Frontend performance via SSR, caching, lazy loading, code splitting</w:t>
+        <w:t>Developed one-click CMS auto-publish functionality with OAuth flows for WordPress, Webflow, and Ghost</w:t>
+      </w:r>
+    </w:p>
+    <w:p>
+      <w:r>
+        <w:t>**HireIQ** | AI-Powered Recruitment &amp; Evaluation Platform</w:t>
       </w:r>
     </w:p>
     <w:p>
@@ -344,15 +213,7 @@
         <w:pStyle w:val="ListBullet"/>
       </w:pPr>
       <w:r>
-        <w:t>**Tech Stack:** Next.js, React.js, TypeScript, Node.js, LangChain, LangGraph, OpenAI API, Tailwind CSS</w:t>
-      </w:r>
-    </w:p>
-    <w:p>
-      <w:pPr>
-        <w:pStyle w:val="Heading3"/>
-      </w:pPr>
-      <w:r>
-        <w:t>HireIQ | AI-Powered Recruitment &amp; Evaluation Platform</w:t>
+        <w:t>Created an AI-assisted recruitment platform using React.js, Node.js, and LangChain</w:t>
       </w:r>
     </w:p>
     <w:p>
@@ -360,7 +221,7 @@
         <w:pStyle w:val="ListBullet"/>
       </w:pPr>
       <w:r>
-        <w:t>AI-assisted recruitment and candidate evaluation platform built end-to-end</w:t>
+        <w:t>Implemented AI-driven candidate evaluation tools to streamline the hiring process</w:t>
       </w:r>
     </w:p>
     <w:p>
@@ -368,15 +229,12 @@
         <w:pStyle w:val="ListBullet"/>
       </w:pPr>
       <w:r>
-        <w:t>**Tech Stack:** Next.js, React, TypeScript, Node.js, LangChain, LangGraph, OpenAI API, Tailwind CSS</w:t>
+        <w:t>Leveraged modern AI development tools to rapidly prototype and test new features</w:t>
       </w:r>
     </w:p>
     <w:p>
-      <w:pPr>
-        <w:pStyle w:val="Heading3"/>
-      </w:pPr>
       <w:r>
-        <w:t>Nextly | Enterprise Headless CMS &amp; SaaS Framework</w:t>
+        <w:t>**Nextly** | Enterprise Headless CMS &amp; SaaS Framework</w:t>
       </w:r>
     </w:p>
     <w:p>
@@ -384,7 +242,7 @@
         <w:pStyle w:val="ListBullet"/>
       </w:pPr>
       <w:r>
-        <w:t>TypeScript-first CMS framework for content-driven products inside Next.js</w:t>
+        <w:t>Developed a TypeScript-first CMS framework using Next.js, React.js, and Node.js</w:t>
       </w:r>
     </w:p>
     <w:p>
@@ -392,7 +250,7 @@
         <w:pStyle w:val="ListBullet"/>
       </w:pPr>
       <w:r>
-        <w:t>Dual-mode content workflow: code-defined models plus drag-and-drop visual builder with instant preview</w:t>
+        <w:t>Built a pluggable multi-database adapter system supporting MongoDB, PostgreSQL, MySQL, and SQLite</w:t>
       </w:r>
     </w:p>
     <w:p>
@@ -400,47 +258,7 @@
         <w:pStyle w:val="ListBullet"/>
       </w:pPr>
       <w:r>
-        <w:t>RBAC with permissions for team content access</w:t>
-      </w:r>
-    </w:p>
-    <w:p>
-      <w:pPr>
-        <w:pStyle w:val="ListBullet"/>
-      </w:pPr>
-      <w:r>
-        <w:t>PostgreSQL, MySQL, SQLite via pluggable Drizzle ORM adapters</w:t>
-      </w:r>
-    </w:p>
-    <w:p>
-      <w:pPr>
-        <w:pStyle w:val="ListBullet"/>
-      </w:pPr>
-      <w:r>
-        <w:t>**Tech Stack:** Next.js, TypeScript, Drizzle ORM, Node.js, TanStack Query, Docker, Monorepo</w:t>
-      </w:r>
-    </w:p>
-    <w:p>
-      <w:pPr>
-        <w:pStyle w:val="Heading3"/>
-      </w:pPr>
-      <w:r>
-        <w:t>21Century Equipment &amp; 4Rivers Equipment | E-Commerce &amp; Rental Platforms</w:t>
-      </w:r>
-    </w:p>
-    <w:p>
-      <w:pPr>
-        <w:pStyle w:val="ListBullet"/>
-      </w:pPr>
-      <w:r>
-        <w:t>B2B equipment management and enterprise e-commerce platforms</w:t>
-      </w:r>
-    </w:p>
-    <w:p>
-      <w:pPr>
-        <w:pStyle w:val="ListBullet"/>
-      </w:pPr>
-      <w:r>
-        <w:t>**Tech Stack:** Next.js, React, Redux Toolkit, Stripe, Google Maps API</w:t>
+        <w:t>Created a fully customizable admin dashboard with role-based access control</w:t>
       </w:r>
     </w:p>
     <w:p>
@@ -452,21 +270,8 @@
       </w:r>
     </w:p>
     <w:p>
-      <w:pPr>
-        <w:pStyle w:val="Heading3"/>
-      </w:pPr>
       <w:r>
-        <w:t>Bachelor of Science in Computer Science</w:t>
-      </w:r>
-    </w:p>
-    <w:p>
-      <w:r>
-        <w:t>*University of Haripur | Haripur, Pakistan*</w:t>
-      </w:r>
-    </w:p>
-    <w:p>
-      <w:r>
-        <w:t>*Aug 2020 - Aug 2024*</w:t>
+        <w:t>**BS in Computer Science** | University of Haripur | Aug 2020 - Aug 2024</w:t>
       </w:r>
     </w:p>
     <w:p>
@@ -478,9 +283,6 @@
       </w:r>
     </w:p>
     <w:p>
-      <w:pPr>
-        <w:pStyle w:val="ListBullet"/>
-      </w:pPr>
       <w:r>
         <w:t>English, Urdu</w:t>
       </w:r>

</xml_diff>

<commit_message>
ci: daily run 2026-10-08
</commit_message>
<xml_diff>
--- a/tailored/cv_appalachian-growth-solutions_full-stack-developer-mern-stack-ai-vibe-.docx
+++ b/tailored/cv_appalachian-growth-solutions_full-stack-developer-mern-stack-ai-vibe-.docx
@@ -17,7 +17,7 @@
     </w:p>
     <w:p>
       <w:r>
-        <w:t>**Email:** muzzamilhassandev@gmail.com | **Phone:** +923055779207 | **LinkedIn:** https://www.linkedin.com/in/muzzamilhassann/ | **GitHub:** https://github.com/muzzamilhassan/ | **Portfolio:** https://muzzamilhassandev.vercel.app/</w:t>
+        <w:t>muzzamilhassandev@gmail.com | +923055779207 | https://muzzamilhassandev.vercel.app/</w:t>
       </w:r>
     </w:p>
     <w:p>
@@ -25,12 +25,12 @@
         <w:pStyle w:val="Heading2"/>
       </w:pPr>
       <w:r>
-        <w:t>Summary</w:t>
+        <w:t>PROFESSIONAL SUMMARY</w:t>
       </w:r>
     </w:p>
     <w:p>
       <w:r>
-        <w:t>Full Stack Developer with extensive experience building production-grade SaaS products using the MERN stack (MongoDB, Express.js, React.js, Node.js). Proficient in both frontend and backend development, with expertise in creating responsive UIs, developing REST APIs, and working with databases. Strong background in AI-assisted development using LangChain, LangGraph, and OpenAI API to accelerate development workflows while maintaining code quality and maintainability.</w:t>
+        <w:t>Full Stack Developer with expertise in building production-grade SaaS applications using the MERN stack (MongoDB, Express.js, React.js, Node.js). Experienced in architecting end-to-end solutions with modern AI integration, including LangChain, LangGraph, and OpenAI API. Proficient in creating responsive UIs, developing REST APIs, and implementing scalable database solutions. Passionate about leveraging AI tools to enhance development speed while maintaining clean, maintainable code.</w:t>
       </w:r>
     </w:p>
     <w:p>
@@ -38,7 +38,7 @@
         <w:pStyle w:val="Heading2"/>
       </w:pPr>
       <w:r>
-        <w:t>Skills</w:t>
+        <w:t>TECHNICAL SKILLS</w:t>
       </w:r>
     </w:p>
     <w:p>
@@ -46,7 +46,7 @@
         <w:pStyle w:val="ListBullet"/>
       </w:pPr>
       <w:r>
-        <w:t>**Languages:** HTML5, CSS3, JavaScript (ES6+), TypeScript</w:t>
+        <w:t>**Frontend**: React.js, Next.js, Redux Toolkit, TanStack Query, Tailwind CSS</w:t>
       </w:r>
     </w:p>
     <w:p>
@@ -54,7 +54,7 @@
         <w:pStyle w:val="ListBullet"/>
       </w:pPr>
       <w:r>
-        <w:t>**Frontend:** React.js, Next.js, Redux Toolkit, TanStack Query, Tailwind CSS</w:t>
+        <w:t>**Backend**: Node.js, Express.js, NestJS, REST API Design, JWT/OAuth2 Authentication</w:t>
       </w:r>
     </w:p>
     <w:p>
@@ -62,7 +62,7 @@
         <w:pStyle w:val="ListBullet"/>
       </w:pPr>
       <w:r>
-        <w:t>**Backend:** Node.js, Express.js, NestJS, REST API Design, JWT/OAuth2 Authentication, RBAC</w:t>
+        <w:t>**Databases**: MongoDB, PostgreSQL, MySQL, SQLite, Drizzle ORM, Firebase, Supabase</w:t>
       </w:r>
     </w:p>
     <w:p>
@@ -70,7 +70,7 @@
         <w:pStyle w:val="ListBullet"/>
       </w:pPr>
       <w:r>
-        <w:t>**Databases:** MongoDB, PostgreSQL, MySQL, SQLite, Drizzle ORM, Firebase, Supabase</w:t>
+        <w:t>**AI Integration**: LangChain, LangGraph, OpenAI API</w:t>
       </w:r>
     </w:p>
     <w:p>
@@ -78,7 +78,7 @@
         <w:pStyle w:val="ListBullet"/>
       </w:pPr>
       <w:r>
-        <w:t>**AI Development:** LangChain, LangGraph, OpenAI API</w:t>
+        <w:t>**Development Tools**: Git, GitHub, Docker, Vercel, AWS Amplify</w:t>
       </w:r>
     </w:p>
     <w:p>
@@ -86,7 +86,7 @@
         <w:pStyle w:val="ListBullet"/>
       </w:pPr>
       <w:r>
-        <w:t>**Tools &amp; Practices:** Git, GitHub, Docker, Component Architecture, Lazy Loading, Code Splitting, SEO, a11y, Performance Optimization</w:t>
+        <w:t>**Additional**: Component Architecture, Code Splitting, SEO, a11y, Performance Optimization</w:t>
       </w:r>
     </w:p>
     <w:p>
@@ -94,12 +94,20 @@
         <w:pStyle w:val="Heading2"/>
       </w:pPr>
       <w:r>
-        <w:t>Professional Experience</w:t>
+        <w:t>PROFESSIONAL EXPERIENCE</w:t>
+      </w:r>
+    </w:p>
+    <w:p>
+      <w:pPr>
+        <w:pStyle w:val="Heading3"/>
+      </w:pPr>
+      <w:r>
+        <w:t>Full Stack Developer | Revnix</w:t>
       </w:r>
     </w:p>
     <w:p>
       <w:r>
-        <w:t>**Full Stack Developer** | Revnix (fmr. Revnix Technologies) | Jan 2025 - Present</w:t>
+        <w:t>*Jan 2025 - Present*</w:t>
       </w:r>
     </w:p>
     <w:p>
@@ -107,7 +115,7 @@
         <w:pStyle w:val="ListBullet"/>
       </w:pPr>
       <w:r>
-        <w:t>Architected and shipped production features for enterprise applications using React.js, Node.js, Express.js, and MongoDB</w:t>
+        <w:t>Architected and shipped production features for an enterprise headless CMS using Next.js, TypeScript, and TanStack Query</w:t>
       </w:r>
     </w:p>
     <w:p>
@@ -115,7 +123,7 @@
         <w:pStyle w:val="ListBullet"/>
       </w:pPr>
       <w:r>
-        <w:t>Developed and maintained REST APIs with JWT-based authentication and flexible RBAC systems</w:t>
+        <w:t>Developed JWT-based authentication and flexible RBAC system for multiple user roles</w:t>
       </w:r>
     </w:p>
     <w:p>
@@ -123,15 +131,7 @@
         <w:pStyle w:val="ListBullet"/>
       </w:pPr>
       <w:r>
-        <w:t>Designed and implemented database solutions with MongoDB and other database systems</w:t>
-      </w:r>
-    </w:p>
-    <w:p>
-      <w:pPr>
-        <w:pStyle w:val="ListBullet"/>
-      </w:pPr>
-      <w:r>
-        <w:t>Built responsive, user-friendly frontend interfaces with React.js and Tailwind CSS</w:t>
+        <w:t>Designed and maintained a pluggable multi-database adapter system supporting MongoDB, PostgreSQL, MySQL, and SQLite</w:t>
       </w:r>
     </w:p>
     <w:p>
@@ -147,7 +147,23 @@
         <w:pStyle w:val="ListBullet"/>
       </w:pPr>
       <w:r>
-        <w:t>Utilized AI tools (LangChain, LangGraph, OpenAI API) to accelerate development workflows and prototype new features</w:t>
+        <w:t>Built customizable admin dashboards and pixel-perfect responsive UIs with strict a11y and SEO standards</w:t>
+      </w:r>
+    </w:p>
+    <w:p>
+      <w:pPr>
+        <w:pStyle w:val="Heading2"/>
+      </w:pPr>
+      <w:r>
+        <w:t>PROJECTS</w:t>
+      </w:r>
+    </w:p>
+    <w:p>
+      <w:pPr>
+        <w:pStyle w:val="Heading3"/>
+      </w:pPr>
+      <w:r>
+        <w:t>RextAI | AI-Powered Content Intelligence Platform</w:t>
       </w:r>
     </w:p>
     <w:p>
@@ -155,28 +171,7 @@
         <w:pStyle w:val="ListBullet"/>
       </w:pPr>
       <w:r>
-        <w:t>Collaborated with team members using Git/GitHub following proper development workflows</w:t>
-      </w:r>
-    </w:p>
-    <w:p>
-      <w:pPr>
-        <w:pStyle w:val="Heading2"/>
-      </w:pPr>
-      <w:r>
-        <w:t>Projects</w:t>
-      </w:r>
-    </w:p>
-    <w:p>
-      <w:r>
-        <w:t>**RextAI** | AI-Powered Content Intelligence Platform</w:t>
-      </w:r>
-    </w:p>
-    <w:p>
-      <w:pPr>
-        <w:pStyle w:val="ListBullet"/>
-      </w:pPr>
-      <w:r>
-        <w:t>Built a SaaS platform for AI-driven content generation and workflow automation using React.js, Node.js, and OpenAI API</w:t>
+        <w:t>Developed a SaaS platform for AI-driven content generation and workflow automation</w:t>
       </w:r>
     </w:p>
     <w:p>
@@ -192,7 +187,7 @@
         <w:pStyle w:val="ListBullet"/>
       </w:pPr>
       <w:r>
-        <w:t>Integrated AI-assisted development tools to accelerate feature implementation and prototyping</w:t>
+        <w:t>Created one-click CMS auto-publish integrating WordPress, Webflow, and Ghost APIs</w:t>
       </w:r>
     </w:p>
     <w:p>
@@ -200,12 +195,15 @@
         <w:pStyle w:val="ListBullet"/>
       </w:pPr>
       <w:r>
-        <w:t>Developed one-click CMS auto-publish functionality with OAuth flows for WordPress, Webflow, and Ghost</w:t>
+        <w:t>Optimized frontend performance using SSR, caching, and code splitting techniques</w:t>
       </w:r>
     </w:p>
     <w:p>
+      <w:pPr>
+        <w:pStyle w:val="Heading3"/>
+      </w:pPr>
       <w:r>
-        <w:t>**HireIQ** | AI-Powered Recruitment &amp; Evaluation Platform</w:t>
+        <w:t>HireIQ | AI-Powered Recruitment &amp; Evaluation Platform</w:t>
       </w:r>
     </w:p>
     <w:p>
@@ -213,7 +211,7 @@
         <w:pStyle w:val="ListBullet"/>
       </w:pPr>
       <w:r>
-        <w:t>Created an AI-assisted recruitment platform using React.js, Node.js, and LangChain</w:t>
+        <w:t>Built an AI-assisted recruitment platform from concept to implementation</w:t>
       </w:r>
     </w:p>
     <w:p>
@@ -221,7 +219,7 @@
         <w:pStyle w:val="ListBullet"/>
       </w:pPr>
       <w:r>
-        <w:t>Implemented AI-driven candidate evaluation tools to streamline the hiring process</w:t>
+        <w:t>Integrated LangChain and OpenAI API for candidate evaluation and assessment</w:t>
       </w:r>
     </w:p>
     <w:p>
@@ -229,12 +227,7 @@
         <w:pStyle w:val="ListBullet"/>
       </w:pPr>
       <w:r>
-        <w:t>Leveraged modern AI development tools to rapidly prototype and test new features</w:t>
-      </w:r>
-    </w:p>
-    <w:p>
-      <w:r>
-        <w:t>**Nextly** | Enterprise Headless CMS &amp; SaaS Framework</w:t>
+        <w:t>Developed responsive UI components with React and TypeScript</w:t>
       </w:r>
     </w:p>
     <w:p>
@@ -242,7 +235,15 @@
         <w:pStyle w:val="ListBullet"/>
       </w:pPr>
       <w:r>
-        <w:t>Developed a TypeScript-first CMS framework using Next.js, React.js, and Node.js</w:t>
+        <w:t>Implemented backend services with Node.js and Express.js</w:t>
+      </w:r>
+    </w:p>
+    <w:p>
+      <w:pPr>
+        <w:pStyle w:val="Heading3"/>
+      </w:pPr>
+      <w:r>
+        <w:t>21Century Equipment | B2B Equipment Management Platform</w:t>
       </w:r>
     </w:p>
     <w:p>
@@ -250,7 +251,7 @@
         <w:pStyle w:val="ListBullet"/>
       </w:pPr>
       <w:r>
-        <w:t>Built a pluggable multi-database adapter system supporting MongoDB, PostgreSQL, MySQL, and SQLite</w:t>
+        <w:t>Developed full-stack application for equipment management</w:t>
       </w:r>
     </w:p>
     <w:p>
@@ -258,7 +259,63 @@
         <w:pStyle w:val="ListBullet"/>
       </w:pPr>
       <w:r>
-        <w:t>Created a fully customizable admin dashboard with role-based access control</w:t>
+        <w:t>Created responsive UI components with React and Redux Toolkit</w:t>
+      </w:r>
+    </w:p>
+    <w:p>
+      <w:pPr>
+        <w:pStyle w:val="ListBullet"/>
+      </w:pPr>
+      <w:r>
+        <w:t>Integrated Stripe payment processing and Google Maps API</w:t>
+      </w:r>
+    </w:p>
+    <w:p>
+      <w:pPr>
+        <w:pStyle w:val="ListBullet"/>
+      </w:pPr>
+      <w:r>
+        <w:t>Implemented MongoDB for data storage and retrieval</w:t>
+      </w:r>
+    </w:p>
+    <w:p>
+      <w:pPr>
+        <w:pStyle w:val="Heading3"/>
+      </w:pPr>
+      <w:r>
+        <w:t>4Rivers Equipment | Enterprise E-Commerce &amp; Rental Platform</w:t>
+      </w:r>
+    </w:p>
+    <w:p>
+      <w:pPr>
+        <w:pStyle w:val="ListBullet"/>
+      </w:pPr>
+      <w:r>
+        <w:t>Built comprehensive e-commerce solution with rental capabilities</w:t>
+      </w:r>
+    </w:p>
+    <w:p>
+      <w:pPr>
+        <w:pStyle w:val="ListBullet"/>
+      </w:pPr>
+      <w:r>
+        <w:t>Developed React frontend with Redux Toolkit for state management</w:t>
+      </w:r>
+    </w:p>
+    <w:p>
+      <w:pPr>
+        <w:pStyle w:val="ListBullet"/>
+      </w:pPr>
+      <w:r>
+        <w:t>Integrated Stripe payment processing and Google Maps functionality</w:t>
+      </w:r>
+    </w:p>
+    <w:p>
+      <w:pPr>
+        <w:pStyle w:val="ListBullet"/>
+      </w:pPr>
+      <w:r>
+        <w:t>Implemented MongoDB for product and inventory management</w:t>
       </w:r>
     </w:p>
     <w:p>
@@ -266,12 +323,17 @@
         <w:pStyle w:val="Heading2"/>
       </w:pPr>
       <w:r>
-        <w:t>Education</w:t>
+        <w:t>EDUCATION</w:t>
       </w:r>
     </w:p>
     <w:p>
       <w:r>
-        <w:t>**BS in Computer Science** | University of Haripur | Aug 2020 - Aug 2024</w:t>
+        <w:t>**BS in Computer Science** | University of Haripur</w:t>
+      </w:r>
+    </w:p>
+    <w:p>
+      <w:r>
+        <w:t>*Aug 2020 - Aug 2024* | Haripur, Pakistan</w:t>
       </w:r>
     </w:p>
     <w:p>
@@ -279,7 +341,7 @@
         <w:pStyle w:val="Heading2"/>
       </w:pPr>
       <w:r>
-        <w:t>Languages</w:t>
+        <w:t>LANGUAGES</w:t>
       </w:r>
     </w:p>
     <w:p>

</xml_diff>